<commit_message>
Update portfolio content, certification links, and resume exports.
</commit_message>
<xml_diff>
--- a/assets/documents/Kirk_Tolleshaug_Resume.docx
+++ b/assets/documents/Kirk_Tolleshaug_Resume.docx
@@ -4,15 +4,7 @@
   <w:body>
     <w:tbl>
       <w:tblPr>
-        <w:tblBorders>
-          <w:top w:val="nil"/>
-          <w:left w:val="nil"/>
-          <w:bottom w:val="nil"/>
-          <w:right w:val="nil"/>
-          <w:insideH w:val="nil"/>
-          <w:insideV w:val="nil"/>
-        </w:tblBorders>
-        <w:tblW w:w="4537" w:type="dxa"/>
+        <w:tblW w:w="4532" w:type="dxa"/>
         <w:jc w:val="start"/>
         <w:tblInd w:w="0" w:type="dxa"/>
         <w:tblLayout w:type="fixed"/>
@@ -25,7 +17,7 @@
       </w:tblPr>
       <w:tblGrid>
         <w:gridCol w:w="540"/>
-        <w:gridCol w:w="3997"/>
+        <w:gridCol w:w="3992"/>
       </w:tblGrid>
       <w:tr>
         <w:trPr/>
@@ -38,8 +30,9 @@
           <w:p>
             <w:pPr>
               <w:pStyle w:val="TableContents"/>
+              <w:keepLines/>
               <w:bidi w:val="0"/>
-              <w:spacing w:before="0" w:after="80"/>
+              <w:spacing w:before="0" w:after="100"/>
               <w:jc w:val="start"/>
               <w:rPr/>
             </w:pPr>
@@ -88,13 +81,14 @@
         </w:tc>
         <w:tc>
           <w:tcPr>
-            <w:tcW w:w="3997" w:type="dxa"/>
+            <w:tcW w:w="3992" w:type="dxa"/>
             <w:tcBorders/>
             <w:vAlign w:val="center"/>
           </w:tcPr>
           <w:p>
             <w:pPr>
               <w:pStyle w:val="Heading1"/>
+              <w:keepLines/>
               <w:bidi w:val="0"/>
               <w:spacing w:before="240" w:after="283"/>
               <w:jc w:val="start"/>
@@ -102,7 +96,7 @@
             </w:pPr>
             <w:r>
               <w:rPr/>
-              <w:t>Kirk Tolleshaug</w:t>
+              <w:t>Kirk Tolleshaug</w:t>
             </w:r>
           </w:p>
         </w:tc>
@@ -111,9 +105,10 @@
     <w:p>
       <w:pPr>
         <w:pStyle w:val="BodyText"/>
+        <w:keepLines/>
         <w:bidi w:val="0"/>
         <w:spacing w:before="60" w:after="60"/>
-        <w:ind w:hanging="0" w:start="700" w:end="60"/>
+        <w:ind w:hanging="0" w:start="680" w:end="60"/>
         <w:jc w:val="start"/>
         <w:rPr>
           <w:b/>
@@ -133,28 +128,234 @@
     <w:p>
       <w:pPr>
         <w:pStyle w:val="BodyText"/>
-        <w:bidi w:val="0"/>
-        <w:spacing w:lineRule="auto" w:line="348"/>
-        <w:ind w:hanging="0" w:start="0" w:end="0"/>
+        <w:keepLines/>
+        <w:bidi w:val="0"/>
+        <w:spacing w:before="80" w:after="80"/>
+        <w:ind w:hanging="0" w:start="80" w:end="80"/>
         <w:jc w:val="end"/>
+        <w:rPr/>
+      </w:pPr>
+      <w:r>
+        <w:rPr/>
+        <w:drawing>
+          <wp:inline distT="0" distB="0" distL="0" distR="0">
+            <wp:extent cx="101600" cy="101600"/>
+            <wp:effectExtent l="0" t="0" r="0" b="0"/>
+            <wp:docPr id="2" name="Image2"/>
+            <wp:cNvGraphicFramePr>
+              <a:graphicFrameLocks xmlns:a="http://schemas.openxmlformats.org/drawingml/2006/main" noChangeAspect="1"/>
+            </wp:cNvGraphicFramePr>
+            <a:graphic xmlns:a="http://schemas.openxmlformats.org/drawingml/2006/main">
+              <a:graphicData uri="http://schemas.openxmlformats.org/drawingml/2006/picture">
+                <pic:pic xmlns:pic="http://schemas.openxmlformats.org/drawingml/2006/picture">
+                  <pic:nvPicPr>
+                    <pic:cNvPr id="2" name="Image2"/>
+                    <pic:cNvPicPr>
+                      <a:picLocks noChangeAspect="1" noChangeArrowheads="1"/>
+                    </pic:cNvPicPr>
+                  </pic:nvPicPr>
+                  <pic:blipFill>
+                    <a:blip r:embed="rId3"/>
+                    <a:stretch>
+                      <a:fillRect/>
+                    </a:stretch>
+                  </pic:blipFill>
+                  <pic:spPr bwMode="auto">
+                    <a:xfrm>
+                      <a:off x="0" y="0"/>
+                      <a:ext cx="101600" cy="101600"/>
+                    </a:xfrm>
+                    <a:prstGeom prst="rect">
+                      <a:avLst/>
+                    </a:prstGeom>
+                    <a:noFill/>
+                  </pic:spPr>
+                </pic:pic>
+              </a:graphicData>
+            </a:graphic>
+          </wp:inline>
+        </w:drawing>
+      </w:r>
+      <w:r>
         <w:rPr>
           <w:color w:val="536058"/>
           <w:sz w:val="15"/>
         </w:rPr>
-      </w:pPr>
+        <w:t xml:space="preserve">Vancouver, Washington, United States · </w:t>
+      </w:r>
+      <w:r>
+        <w:rPr/>
+        <w:drawing>
+          <wp:inline distT="0" distB="0" distL="0" distR="0">
+            <wp:extent cx="101600" cy="101600"/>
+            <wp:effectExtent l="0" t="0" r="0" b="0"/>
+            <wp:docPr id="3" name="Image3"/>
+            <wp:cNvGraphicFramePr>
+              <a:graphicFrameLocks xmlns:a="http://schemas.openxmlformats.org/drawingml/2006/main" noChangeAspect="1"/>
+            </wp:cNvGraphicFramePr>
+            <a:graphic xmlns:a="http://schemas.openxmlformats.org/drawingml/2006/main">
+              <a:graphicData uri="http://schemas.openxmlformats.org/drawingml/2006/picture">
+                <pic:pic xmlns:pic="http://schemas.openxmlformats.org/drawingml/2006/picture">
+                  <pic:nvPicPr>
+                    <pic:cNvPr id="3" name="Image3"/>
+                    <pic:cNvPicPr>
+                      <a:picLocks noChangeAspect="1" noChangeArrowheads="1"/>
+                    </pic:cNvPicPr>
+                  </pic:nvPicPr>
+                  <pic:blipFill>
+                    <a:blip r:embed="rId4"/>
+                    <a:stretch>
+                      <a:fillRect/>
+                    </a:stretch>
+                  </pic:blipFill>
+                  <pic:spPr bwMode="auto">
+                    <a:xfrm>
+                      <a:off x="0" y="0"/>
+                      <a:ext cx="101600" cy="101600"/>
+                    </a:xfrm>
+                    <a:prstGeom prst="rect">
+                      <a:avLst/>
+                    </a:prstGeom>
+                    <a:noFill/>
+                  </pic:spPr>
+                </pic:pic>
+              </a:graphicData>
+            </a:graphic>
+          </wp:inline>
+        </w:drawing>
+      </w:r>
+      <w:hyperlink r:id="rId5">
+        <w:r>
+          <w:rPr>
+            <w:rStyle w:val="Hyperlink"/>
+            <w:color w:val="536058"/>
+            <w:sz w:val="15"/>
+          </w:rPr>
+          <w:t>kirk@ktoll.dev</w:t>
+        </w:r>
+      </w:hyperlink>
       <w:r>
         <w:rPr>
           <w:color w:val="536058"/>
           <w:sz w:val="15"/>
         </w:rPr>
-        <w:t>Vancouver, Washington, United Stateskirk@ktoll.dev · ktoll.devlinkedin.com/in/ktolleshaug</w:t>
-      </w:r>
+        <w:t xml:space="preserve"> · </w:t>
+      </w:r>
+      <w:r>
+        <w:rPr/>
+        <w:drawing>
+          <wp:inline distT="0" distB="0" distL="0" distR="0">
+            <wp:extent cx="101600" cy="101600"/>
+            <wp:effectExtent l="0" t="0" r="0" b="0"/>
+            <wp:docPr id="4" name="Image4"/>
+            <wp:cNvGraphicFramePr>
+              <a:graphicFrameLocks xmlns:a="http://schemas.openxmlformats.org/drawingml/2006/main" noChangeAspect="1"/>
+            </wp:cNvGraphicFramePr>
+            <a:graphic xmlns:a="http://schemas.openxmlformats.org/drawingml/2006/main">
+              <a:graphicData uri="http://schemas.openxmlformats.org/drawingml/2006/picture">
+                <pic:pic xmlns:pic="http://schemas.openxmlformats.org/drawingml/2006/picture">
+                  <pic:nvPicPr>
+                    <pic:cNvPr id="4" name="Image4"/>
+                    <pic:cNvPicPr>
+                      <a:picLocks noChangeAspect="1" noChangeArrowheads="1"/>
+                    </pic:cNvPicPr>
+                  </pic:nvPicPr>
+                  <pic:blipFill>
+                    <a:blip r:embed="rId6"/>
+                    <a:stretch>
+                      <a:fillRect/>
+                    </a:stretch>
+                  </pic:blipFill>
+                  <pic:spPr bwMode="auto">
+                    <a:xfrm>
+                      <a:off x="0" y="0"/>
+                      <a:ext cx="101600" cy="101600"/>
+                    </a:xfrm>
+                    <a:prstGeom prst="rect">
+                      <a:avLst/>
+                    </a:prstGeom>
+                    <a:noFill/>
+                  </pic:spPr>
+                </pic:pic>
+              </a:graphicData>
+            </a:graphic>
+          </wp:inline>
+        </w:drawing>
+      </w:r>
+      <w:hyperlink r:id="rId7">
+        <w:r>
+          <w:rPr>
+            <w:rStyle w:val="Hyperlink"/>
+            <w:color w:val="536058"/>
+            <w:sz w:val="15"/>
+          </w:rPr>
+          <w:t>/in/ktolleshaug</w:t>
+        </w:r>
+      </w:hyperlink>
+      <w:r>
+        <w:rPr>
+          <w:color w:val="536058"/>
+          <w:sz w:val="15"/>
+        </w:rPr>
+        <w:t xml:space="preserve"> · </w:t>
+      </w:r>
+      <w:r>
+        <w:rPr/>
+        <w:drawing>
+          <wp:inline distT="0" distB="0" distL="0" distR="0">
+            <wp:extent cx="101600" cy="101600"/>
+            <wp:effectExtent l="0" t="0" r="0" b="0"/>
+            <wp:docPr id="5" name="Image5"/>
+            <wp:cNvGraphicFramePr>
+              <a:graphicFrameLocks xmlns:a="http://schemas.openxmlformats.org/drawingml/2006/main" noChangeAspect="1"/>
+            </wp:cNvGraphicFramePr>
+            <a:graphic xmlns:a="http://schemas.openxmlformats.org/drawingml/2006/main">
+              <a:graphicData uri="http://schemas.openxmlformats.org/drawingml/2006/picture">
+                <pic:pic xmlns:pic="http://schemas.openxmlformats.org/drawingml/2006/picture">
+                  <pic:nvPicPr>
+                    <pic:cNvPr id="5" name="Image5"/>
+                    <pic:cNvPicPr>
+                      <a:picLocks noChangeAspect="1" noChangeArrowheads="1"/>
+                    </pic:cNvPicPr>
+                  </pic:nvPicPr>
+                  <pic:blipFill>
+                    <a:blip r:embed="rId8"/>
+                    <a:stretch>
+                      <a:fillRect/>
+                    </a:stretch>
+                  </pic:blipFill>
+                  <pic:spPr bwMode="auto">
+                    <a:xfrm>
+                      <a:off x="0" y="0"/>
+                      <a:ext cx="101600" cy="101600"/>
+                    </a:xfrm>
+                    <a:prstGeom prst="rect">
+                      <a:avLst/>
+                    </a:prstGeom>
+                    <a:noFill/>
+                  </pic:spPr>
+                </pic:pic>
+              </a:graphicData>
+            </a:graphic>
+          </wp:inline>
+        </w:drawing>
+      </w:r>
+      <w:hyperlink r:id="rId9">
+        <w:r>
+          <w:rPr>
+            <w:rStyle w:val="Hyperlink"/>
+            <w:color w:val="536058"/>
+            <w:sz w:val="15"/>
+          </w:rPr>
+          <w:t>ktoll.dev</w:t>
+        </w:r>
+      </w:hyperlink>
     </w:p>
     <w:p>
       <w:pPr>
         <w:pStyle w:val="Heading2"/>
-        <w:bidi w:val="0"/>
-        <w:ind w:hanging="0" w:start="0" w:end="0"/>
+        <w:keepLines/>
+        <w:bidi w:val="0"/>
         <w:jc w:val="start"/>
         <w:rPr/>
       </w:pPr>
@@ -166,6 +367,7 @@
     <w:p>
       <w:pPr>
         <w:pStyle w:val="BodyText"/>
+        <w:keepLines/>
         <w:bidi w:val="0"/>
         <w:jc w:val="start"/>
         <w:rPr/>
@@ -178,6 +380,7 @@
     <w:p>
       <w:pPr>
         <w:pStyle w:val="BodyText"/>
+        <w:keepLines/>
         <w:bidi w:val="0"/>
         <w:jc w:val="start"/>
         <w:rPr/>
@@ -190,6 +393,7 @@
     <w:p>
       <w:pPr>
         <w:pStyle w:val="BodyText"/>
+        <w:keepLines/>
         <w:bidi w:val="0"/>
         <w:jc w:val="start"/>
         <w:rPr/>
@@ -202,6 +406,7 @@
     <w:p>
       <w:pPr>
         <w:pStyle w:val="BodyText"/>
+        <w:keepLines/>
         <w:bidi w:val="0"/>
         <w:jc w:val="start"/>
         <w:rPr/>
@@ -214,6 +419,7 @@
     <w:p>
       <w:pPr>
         <w:pStyle w:val="BodyText"/>
+        <w:keepLines/>
         <w:bidi w:val="0"/>
         <w:jc w:val="start"/>
         <w:rPr/>
@@ -226,6 +432,7 @@
     <w:p>
       <w:pPr>
         <w:pStyle w:val="Heading2"/>
+        <w:keepLines/>
         <w:bidi w:val="0"/>
         <w:jc w:val="start"/>
         <w:rPr/>
@@ -237,7 +444,8 @@
     </w:p>
     <w:p>
       <w:pPr>
-        <w:pStyle w:val="BodyTextskill"/>
+        <w:pStyle w:val="BodyText"/>
+        <w:keepLines/>
         <w:bidi w:val="0"/>
         <w:jc w:val="start"/>
         <w:rPr/>
@@ -255,7 +463,8 @@
     </w:p>
     <w:p>
       <w:pPr>
-        <w:pStyle w:val="BodyTextskill"/>
+        <w:pStyle w:val="BodyText"/>
+        <w:keepLines/>
         <w:bidi w:val="0"/>
         <w:jc w:val="start"/>
         <w:rPr/>
@@ -273,7 +482,8 @@
     </w:p>
     <w:p>
       <w:pPr>
-        <w:pStyle w:val="BodyTextskill"/>
+        <w:pStyle w:val="BodyText"/>
+        <w:keepLines/>
         <w:bidi w:val="0"/>
         <w:jc w:val="start"/>
         <w:rPr/>
@@ -291,7 +501,8 @@
     </w:p>
     <w:p>
       <w:pPr>
-        <w:pStyle w:val="BodyTextskill"/>
+        <w:pStyle w:val="BodyText"/>
+        <w:keepLines/>
         <w:bidi w:val="0"/>
         <w:jc w:val="start"/>
         <w:rPr/>
@@ -309,7 +520,8 @@
     </w:p>
     <w:p>
       <w:pPr>
-        <w:pStyle w:val="BodyTextskill"/>
+        <w:pStyle w:val="BodyText"/>
+        <w:keepLines/>
         <w:bidi w:val="0"/>
         <w:jc w:val="start"/>
         <w:rPr/>
@@ -327,7 +539,8 @@
     </w:p>
     <w:p>
       <w:pPr>
-        <w:pStyle w:val="BodyTextskill"/>
+        <w:pStyle w:val="BodyText"/>
+        <w:keepLines/>
         <w:bidi w:val="0"/>
         <w:jc w:val="start"/>
         <w:rPr/>
@@ -346,6 +559,7 @@
     <w:p>
       <w:pPr>
         <w:pStyle w:val="Heading2"/>
+        <w:keepLines/>
         <w:bidi w:val="0"/>
         <w:jc w:val="start"/>
         <w:rPr/>
@@ -358,7 +572,9 @@
     <w:p>
       <w:pPr>
         <w:pStyle w:val="Heading3"/>
-        <w:bidi w:val="0"/>
+        <w:keepLines/>
+        <w:bidi w:val="0"/>
+        <w:ind w:hanging="0" w:start="0" w:end="0"/>
         <w:jc w:val="start"/>
         <w:rPr/>
       </w:pPr>
@@ -370,31 +586,39 @@
     <w:p>
       <w:pPr>
         <w:pStyle w:val="BodyText"/>
-        <w:bidi w:val="0"/>
-        <w:spacing w:before="40" w:after="80"/>
-        <w:ind w:hanging="0" w:start="40" w:end="40"/>
+        <w:keepLines/>
+        <w:bidi w:val="0"/>
         <w:jc w:val="start"/>
         <w:rPr/>
       </w:pPr>
       <w:r>
         <w:rPr>
           <w:rStyle w:val="Strong"/>
-          <w:color w:val="536058"/>
-          <w:sz w:val="15"/>
         </w:rPr>
         <w:t>Software Engineer</w:t>
       </w:r>
       <w:r>
-        <w:rPr>
-          <w:color w:val="536058"/>
-          <w:sz w:val="15"/>
-        </w:rPr>
+        <w:rPr/>
+        <w:t xml:space="preserve"> </w:t>
+      </w:r>
+    </w:p>
+    <w:p>
+      <w:pPr>
+        <w:pStyle w:val="BodyTextdate"/>
+        <w:keepLines/>
+        <w:bidi w:val="0"/>
+        <w:jc w:val="start"/>
+        <w:rPr/>
+      </w:pPr>
+      <w:r>
+        <w:rPr/>
         <w:t>December 2022 - Present · Springfield, MO</w:t>
       </w:r>
     </w:p>
     <w:p>
       <w:pPr>
         <w:pStyle w:val="BodyText"/>
+        <w:keepLines/>
         <w:bidi w:val="0"/>
         <w:jc w:val="start"/>
         <w:rPr/>
@@ -406,263 +630,371 @@
     </w:p>
     <w:p>
       <w:pPr>
-        <w:pStyle w:val="BodyText"/>
-        <w:numPr>
-          <w:ilvl w:val="0"/>
-          <w:numId w:val="1"/>
-        </w:numPr>
-        <w:tabs>
-          <w:tab w:val="clear" w:pos="1134"/>
-          <w:tab w:val="left" w:pos="709" w:leader="none"/>
-        </w:tabs>
-        <w:bidi w:val="0"/>
-        <w:spacing w:before="0" w:after="0"/>
-        <w:ind w:hanging="283" w:start="709"/>
-        <w:jc w:val="start"/>
-        <w:rPr/>
-      </w:pPr>
-      <w:r>
-        <w:rPr/>
-        <w:t>Design and optimize C#/.NET backend services and REST APIs supporting internal web and mobile applications, external integrations, tens of thousands of users, and millions of security devices.</w:t>
-      </w:r>
-    </w:p>
-    <w:p>
-      <w:pPr>
-        <w:pStyle w:val="BodyText"/>
-        <w:numPr>
-          <w:ilvl w:val="0"/>
-          <w:numId w:val="1"/>
-        </w:numPr>
-        <w:tabs>
-          <w:tab w:val="clear" w:pos="1134"/>
-          <w:tab w:val="left" w:pos="709" w:leader="none"/>
-        </w:tabs>
-        <w:bidi w:val="0"/>
-        <w:spacing w:before="0" w:after="0"/>
-        <w:ind w:hanging="283" w:start="709"/>
-        <w:jc w:val="start"/>
-        <w:rPr/>
-      </w:pPr>
-      <w:r>
-        <w:rPr/>
-        <w:t>Design and version public REST APIs, introducing v2 routes and schemas while deprecating v1 endpoints; maintain OpenAPI/Swagger documentation and configure Azure API Management with JWT validation, subscription keys, rate limits, and request transformations.</w:t>
-      </w:r>
-    </w:p>
-    <w:p>
-      <w:pPr>
-        <w:pStyle w:val="BodyText"/>
-        <w:numPr>
-          <w:ilvl w:val="0"/>
-          <w:numId w:val="1"/>
-        </w:numPr>
-        <w:tabs>
-          <w:tab w:val="clear" w:pos="1134"/>
-          <w:tab w:val="left" w:pos="709" w:leader="none"/>
-        </w:tabs>
-        <w:bidi w:val="0"/>
-        <w:spacing w:before="0" w:after="0"/>
-        <w:ind w:hanging="283" w:start="709"/>
-        <w:jc w:val="start"/>
-        <w:rPr/>
-      </w:pPr>
-      <w:r>
-        <w:rPr/>
-        <w:t>Implement authentication services and standardize JWT handling through internal libraries, establishing Azure Key Vault usage for secure application secret management.</w:t>
-      </w:r>
-    </w:p>
-    <w:p>
-      <w:pPr>
-        <w:pStyle w:val="BodyText"/>
-        <w:numPr>
-          <w:ilvl w:val="0"/>
-          <w:numId w:val="1"/>
-        </w:numPr>
-        <w:tabs>
-          <w:tab w:val="clear" w:pos="1134"/>
-          <w:tab w:val="left" w:pos="709" w:leader="none"/>
-        </w:tabs>
-        <w:bidi w:val="0"/>
-        <w:spacing w:before="0" w:after="0"/>
-        <w:ind w:hanging="283" w:start="709"/>
-        <w:jc w:val="start"/>
-        <w:rPr/>
-      </w:pPr>
-      <w:r>
-        <w:rPr/>
-        <w:t>Diagnose performance bottlenecks across memory, request processing, concurrency, and workload distribution, reducing operations from hours to minutes, minutes to seconds, and selected API paths to sub-second response times.</w:t>
-      </w:r>
-    </w:p>
-    <w:p>
-      <w:pPr>
-        <w:pStyle w:val="BodyText"/>
-        <w:numPr>
-          <w:ilvl w:val="0"/>
-          <w:numId w:val="1"/>
-        </w:numPr>
-        <w:tabs>
-          <w:tab w:val="clear" w:pos="1134"/>
-          <w:tab w:val="left" w:pos="709" w:leader="none"/>
-        </w:tabs>
-        <w:bidi w:val="0"/>
-        <w:spacing w:before="0" w:after="0"/>
-        <w:ind w:hanging="283" w:start="709"/>
-        <w:jc w:val="start"/>
-        <w:rPr/>
-      </w:pPr>
-      <w:r>
-        <w:rPr/>
-        <w:t>Build resilient RabbitMQ event and job workflows using dead-letter queues, duplicate-event protection, retry logic, pending-message validation, and idempotent API handling.</w:t>
-      </w:r>
-    </w:p>
-    <w:p>
-      <w:pPr>
-        <w:pStyle w:val="BodyText"/>
-        <w:numPr>
-          <w:ilvl w:val="0"/>
-          <w:numId w:val="1"/>
-        </w:numPr>
-        <w:tabs>
-          <w:tab w:val="clear" w:pos="1134"/>
-          <w:tab w:val="left" w:pos="709" w:leader="none"/>
-        </w:tabs>
-        <w:bidi w:val="0"/>
-        <w:spacing w:before="0" w:after="0"/>
-        <w:ind w:hanging="283" w:start="709"/>
-        <w:jc w:val="start"/>
-        <w:rPr/>
-      </w:pPr>
-      <w:r>
-        <w:rPr/>
-        <w:t>Modernize legacy .NET services and containerize local dependencies with Docker Compose, improving CI/CD reliability and cross-team development compatibility.</w:t>
-      </w:r>
-    </w:p>
-    <w:p>
-      <w:pPr>
-        <w:pStyle w:val="BodyText"/>
-        <w:numPr>
-          <w:ilvl w:val="0"/>
-          <w:numId w:val="1"/>
-        </w:numPr>
-        <w:tabs>
-          <w:tab w:val="clear" w:pos="1134"/>
-          <w:tab w:val="left" w:pos="709" w:leader="none"/>
-        </w:tabs>
-        <w:bidi w:val="0"/>
-        <w:spacing w:before="0" w:after="0"/>
-        <w:ind w:hanging="283" w:start="709"/>
-        <w:jc w:val="start"/>
-        <w:rPr/>
-      </w:pPr>
-      <w:r>
-        <w:rPr/>
-        <w:t>Design SQL queries, stored procedures, and indexes across SQL Server and PostgreSQL; manage PostgreSQL schema migrations, backward-compatible changes, data backfills, and production rollouts.</w:t>
-      </w:r>
-    </w:p>
-    <w:p>
-      <w:pPr>
-        <w:pStyle w:val="BodyText"/>
-        <w:numPr>
-          <w:ilvl w:val="0"/>
-          <w:numId w:val="1"/>
-        </w:numPr>
-        <w:tabs>
-          <w:tab w:val="clear" w:pos="1134"/>
-          <w:tab w:val="left" w:pos="709" w:leader="none"/>
-        </w:tabs>
-        <w:bidi w:val="0"/>
-        <w:spacing w:before="0" w:after="0"/>
-        <w:ind w:hanging="283" w:start="709"/>
-        <w:jc w:val="start"/>
-        <w:rPr/>
-      </w:pPr>
-      <w:r>
-        <w:rPr/>
-        <w:t>Build observability with Serilog and New Relic, publishing metrics and dashboards for service performance and health.</w:t>
-      </w:r>
-    </w:p>
-    <w:p>
-      <w:pPr>
-        <w:pStyle w:val="BodyText"/>
-        <w:numPr>
-          <w:ilvl w:val="0"/>
-          <w:numId w:val="1"/>
-        </w:numPr>
-        <w:tabs>
-          <w:tab w:val="clear" w:pos="1134"/>
-          <w:tab w:val="left" w:pos="709" w:leader="none"/>
-        </w:tabs>
-        <w:bidi w:val="0"/>
-        <w:spacing w:before="0" w:after="0"/>
-        <w:ind w:hanging="283" w:start="709"/>
-        <w:jc w:val="start"/>
-        <w:rPr/>
-      </w:pPr>
-      <w:r>
-        <w:rPr/>
-        <w:t>Design a Go-based security-camera integration using REST APIs and bidirectional gRPC; prototype mesh communication for relaying messages during connectivity loss.</w:t>
-      </w:r>
-    </w:p>
-    <w:p>
-      <w:pPr>
-        <w:pStyle w:val="BodyText"/>
-        <w:numPr>
-          <w:ilvl w:val="0"/>
-          <w:numId w:val="1"/>
-        </w:numPr>
-        <w:tabs>
-          <w:tab w:val="clear" w:pos="1134"/>
-          <w:tab w:val="left" w:pos="709" w:leader="none"/>
-        </w:tabs>
-        <w:bidi w:val="0"/>
-        <w:ind w:hanging="283" w:start="709"/>
-        <w:jc w:val="start"/>
-        <w:rPr/>
-      </w:pPr>
-      <w:r>
-        <w:rPr/>
-        <w:t>Provide technical leadership through architecture, design discussions, project decomposition, mentoring, and engineering/QA coordination.</w:t>
-      </w:r>
-    </w:p>
-    <w:p>
-      <w:pPr>
-        <w:pStyle w:val="Heading3"/>
-        <w:bidi w:val="0"/>
-        <w:jc w:val="start"/>
-        <w:rPr/>
-      </w:pPr>
-      <w:r>
-        <w:rPr/>
-        <w:t>Vizient, Inc</w:t>
-      </w:r>
-    </w:p>
-    <w:p>
-      <w:pPr>
-        <w:pStyle w:val="BodyText"/>
-        <w:bidi w:val="0"/>
-        <w:spacing w:before="40" w:after="80"/>
-        <w:ind w:hanging="0" w:start="40" w:end="40"/>
+        <w:pStyle w:val="BodyTextrelevant"/>
+        <w:keepLines/>
+        <w:bidi w:val="0"/>
         <w:jc w:val="start"/>
         <w:rPr/>
       </w:pPr>
       <w:r>
         <w:rPr>
           <w:rStyle w:val="Strong"/>
-          <w:color w:val="536058"/>
-          <w:sz w:val="15"/>
+        </w:rPr>
+        <w:t>Relevant Skills:</w:t>
+      </w:r>
+      <w:r>
+        <w:rPr/>
+        <w:t xml:space="preserve"> C# in .NET, REST APIs, RabbitMQ, Azure API Management, Docker, PostgreSQL, New Relic, Technical Leadership</w:t>
+      </w:r>
+    </w:p>
+    <w:p>
+      <w:pPr>
+        <w:pStyle w:val="BodyText"/>
+        <w:keepLines/>
+        <w:numPr>
+          <w:ilvl w:val="0"/>
+          <w:numId w:val="1"/>
+        </w:numPr>
+        <w:tabs>
+          <w:tab w:val="clear" w:pos="1134"/>
+          <w:tab w:val="left" w:pos="709" w:leader="none"/>
+        </w:tabs>
+        <w:bidi w:val="0"/>
+        <w:spacing w:before="0" w:after="0"/>
+        <w:ind w:hanging="283" w:start="709"/>
+        <w:jc w:val="start"/>
+        <w:rPr/>
+      </w:pPr>
+      <w:r>
+        <w:rPr/>
+        <w:t>Design and optimize C#/.NET backend services and REST APIs supporting internal web and mobile applications, external integrations, tens of thousands of users, and millions of security devices.</w:t>
+      </w:r>
+    </w:p>
+    <w:p>
+      <w:pPr>
+        <w:pStyle w:val="BodyText"/>
+        <w:keepLines/>
+        <w:numPr>
+          <w:ilvl w:val="0"/>
+          <w:numId w:val="1"/>
+        </w:numPr>
+        <w:tabs>
+          <w:tab w:val="clear" w:pos="1134"/>
+          <w:tab w:val="left" w:pos="709" w:leader="none"/>
+        </w:tabs>
+        <w:bidi w:val="0"/>
+        <w:spacing w:before="0" w:after="0"/>
+        <w:ind w:hanging="283" w:start="709"/>
+        <w:jc w:val="start"/>
+        <w:rPr/>
+      </w:pPr>
+      <w:r>
+        <w:rPr/>
+        <w:t>Design and version public REST APIs, introducing v2 routes and schemas while deprecating v1 endpoints; maintain OpenAPI/Swagger documentation and configure Azure API Management with JWT validation, subscription keys, rate limits, and request transformations.</w:t>
+      </w:r>
+    </w:p>
+    <w:p>
+      <w:pPr>
+        <w:pStyle w:val="BodyText"/>
+        <w:keepLines/>
+        <w:numPr>
+          <w:ilvl w:val="0"/>
+          <w:numId w:val="1"/>
+        </w:numPr>
+        <w:tabs>
+          <w:tab w:val="clear" w:pos="1134"/>
+          <w:tab w:val="left" w:pos="709" w:leader="none"/>
+        </w:tabs>
+        <w:bidi w:val="0"/>
+        <w:spacing w:before="0" w:after="0"/>
+        <w:ind w:hanging="283" w:start="709"/>
+        <w:jc w:val="start"/>
+        <w:rPr/>
+      </w:pPr>
+      <w:r>
+        <w:rPr/>
+        <w:t>Implement authentication services and standardize JWT handling through internal libraries, establishing Azure Key Vault usage for secure application secret management.</w:t>
+      </w:r>
+    </w:p>
+    <w:p>
+      <w:pPr>
+        <w:pStyle w:val="BodyText"/>
+        <w:keepLines/>
+        <w:numPr>
+          <w:ilvl w:val="0"/>
+          <w:numId w:val="1"/>
+        </w:numPr>
+        <w:tabs>
+          <w:tab w:val="clear" w:pos="1134"/>
+          <w:tab w:val="left" w:pos="709" w:leader="none"/>
+        </w:tabs>
+        <w:bidi w:val="0"/>
+        <w:spacing w:before="0" w:after="0"/>
+        <w:ind w:hanging="283" w:start="709"/>
+        <w:jc w:val="start"/>
+        <w:rPr/>
+      </w:pPr>
+      <w:r>
+        <w:rPr/>
+        <w:t>Diagnose performance bottlenecks across memory, request processing, concurrency, and workload distribution, reducing operations from hours to minutes, minutes to seconds, and selected API paths to sub-second response times.</w:t>
+      </w:r>
+    </w:p>
+    <w:p>
+      <w:pPr>
+        <w:pStyle w:val="BodyText"/>
+        <w:keepLines/>
+        <w:numPr>
+          <w:ilvl w:val="0"/>
+          <w:numId w:val="1"/>
+        </w:numPr>
+        <w:tabs>
+          <w:tab w:val="clear" w:pos="1134"/>
+          <w:tab w:val="left" w:pos="709" w:leader="none"/>
+        </w:tabs>
+        <w:bidi w:val="0"/>
+        <w:spacing w:before="0" w:after="0"/>
+        <w:ind w:hanging="283" w:start="709"/>
+        <w:jc w:val="start"/>
+        <w:rPr/>
+      </w:pPr>
+      <w:r>
+        <w:rPr/>
+        <w:t>Build resilient RabbitMQ event and job workflows using dead-letter queues, duplicate-event protection, retry logic, pending-message validation, and idempotent API handling.</w:t>
+      </w:r>
+    </w:p>
+    <w:p>
+      <w:pPr>
+        <w:pStyle w:val="BodyText"/>
+        <w:keepLines/>
+        <w:numPr>
+          <w:ilvl w:val="0"/>
+          <w:numId w:val="1"/>
+        </w:numPr>
+        <w:tabs>
+          <w:tab w:val="clear" w:pos="1134"/>
+          <w:tab w:val="left" w:pos="709" w:leader="none"/>
+        </w:tabs>
+        <w:bidi w:val="0"/>
+        <w:spacing w:before="0" w:after="0"/>
+        <w:ind w:hanging="283" w:start="709"/>
+        <w:jc w:val="start"/>
+        <w:rPr/>
+      </w:pPr>
+      <w:r>
+        <w:rPr/>
+        <w:t>Modernize legacy services from .NET Framework 4.x and .NET Core 3 to modern .NET, and containerize local dependencies with Docker Compose to improve CI/CD reliability and cross-team development compatibility.</w:t>
+      </w:r>
+    </w:p>
+    <w:p>
+      <w:pPr>
+        <w:pStyle w:val="BodyText"/>
+        <w:keepLines/>
+        <w:numPr>
+          <w:ilvl w:val="0"/>
+          <w:numId w:val="1"/>
+        </w:numPr>
+        <w:tabs>
+          <w:tab w:val="clear" w:pos="1134"/>
+          <w:tab w:val="left" w:pos="709" w:leader="none"/>
+        </w:tabs>
+        <w:bidi w:val="0"/>
+        <w:spacing w:before="0" w:after="0"/>
+        <w:ind w:hanging="283" w:start="709"/>
+        <w:jc w:val="start"/>
+        <w:rPr/>
+      </w:pPr>
+      <w:r>
+        <w:rPr/>
+        <w:t>Use AI-assisted engineering tools to analyze unfamiliar code paths, accelerate legacy refactoring and modernization, investigate defects, and review changes, with developer-owned validation through tests and code review.</w:t>
+      </w:r>
+    </w:p>
+    <w:p>
+      <w:pPr>
+        <w:pStyle w:val="BodyText"/>
+        <w:keepLines/>
+        <w:numPr>
+          <w:ilvl w:val="0"/>
+          <w:numId w:val="1"/>
+        </w:numPr>
+        <w:tabs>
+          <w:tab w:val="clear" w:pos="1134"/>
+          <w:tab w:val="left" w:pos="709" w:leader="none"/>
+        </w:tabs>
+        <w:bidi w:val="0"/>
+        <w:spacing w:before="0" w:after="0"/>
+        <w:ind w:hanging="283" w:start="709"/>
+        <w:jc w:val="start"/>
+        <w:rPr/>
+      </w:pPr>
+      <w:r>
+        <w:rPr/>
+        <w:t>Apply AI-assisted analysis to logs and traces, dependency mapping, API and schema compatibility reviews, test-case generation, and drafting technical documentation, migration plans, and release notes.</w:t>
+      </w:r>
+    </w:p>
+    <w:p>
+      <w:pPr>
+        <w:pStyle w:val="BodyText"/>
+        <w:keepLines/>
+        <w:numPr>
+          <w:ilvl w:val="0"/>
+          <w:numId w:val="1"/>
+        </w:numPr>
+        <w:tabs>
+          <w:tab w:val="clear" w:pos="1134"/>
+          <w:tab w:val="left" w:pos="709" w:leader="none"/>
+        </w:tabs>
+        <w:bidi w:val="0"/>
+        <w:spacing w:before="0" w:after="0"/>
+        <w:ind w:hanging="283" w:start="709"/>
+        <w:jc w:val="start"/>
+        <w:rPr/>
+      </w:pPr>
+      <w:r>
+        <w:rPr/>
+        <w:t>Design SQL queries, stored procedures, and indexes across SQL Server and PostgreSQL; manage PostgreSQL schema migrations, backward-compatible changes, data backfills, and production rollouts.</w:t>
+      </w:r>
+    </w:p>
+    <w:p>
+      <w:pPr>
+        <w:pStyle w:val="BodyText"/>
+        <w:keepLines/>
+        <w:numPr>
+          <w:ilvl w:val="0"/>
+          <w:numId w:val="1"/>
+        </w:numPr>
+        <w:tabs>
+          <w:tab w:val="clear" w:pos="1134"/>
+          <w:tab w:val="left" w:pos="709" w:leader="none"/>
+        </w:tabs>
+        <w:bidi w:val="0"/>
+        <w:spacing w:before="0" w:after="0"/>
+        <w:ind w:hanging="283" w:start="709"/>
+        <w:jc w:val="start"/>
+        <w:rPr/>
+      </w:pPr>
+      <w:r>
+        <w:rPr/>
+        <w:t>Build observability with Serilog and New Relic, publishing metrics and dashboards for service performance and health.</w:t>
+      </w:r>
+    </w:p>
+    <w:p>
+      <w:pPr>
+        <w:pStyle w:val="BodyText"/>
+        <w:keepLines/>
+        <w:numPr>
+          <w:ilvl w:val="0"/>
+          <w:numId w:val="1"/>
+        </w:numPr>
+        <w:tabs>
+          <w:tab w:val="clear" w:pos="1134"/>
+          <w:tab w:val="left" w:pos="709" w:leader="none"/>
+        </w:tabs>
+        <w:bidi w:val="0"/>
+        <w:spacing w:before="0" w:after="0"/>
+        <w:ind w:hanging="283" w:start="709"/>
+        <w:jc w:val="start"/>
+        <w:rPr/>
+      </w:pPr>
+      <w:r>
+        <w:rPr/>
+        <w:t>Develop React-based user interfaces and application workflows supporting backend services and operational needs.</w:t>
+      </w:r>
+    </w:p>
+    <w:p>
+      <w:pPr>
+        <w:pStyle w:val="BodyText"/>
+        <w:keepLines/>
+        <w:numPr>
+          <w:ilvl w:val="0"/>
+          <w:numId w:val="1"/>
+        </w:numPr>
+        <w:tabs>
+          <w:tab w:val="clear" w:pos="1134"/>
+          <w:tab w:val="left" w:pos="709" w:leader="none"/>
+        </w:tabs>
+        <w:bidi w:val="0"/>
+        <w:spacing w:before="0" w:after="0"/>
+        <w:ind w:hanging="283" w:start="709"/>
+        <w:jc w:val="start"/>
+        <w:rPr/>
+      </w:pPr>
+      <w:r>
+        <w:rPr/>
+        <w:t>Design a Go-based security-camera integration using REST APIs and bidirectional gRPC; prototype mesh communication for relaying messages during connectivity loss.</w:t>
+      </w:r>
+    </w:p>
+    <w:p>
+      <w:pPr>
+        <w:pStyle w:val="BodyText"/>
+        <w:keepLines/>
+        <w:numPr>
+          <w:ilvl w:val="0"/>
+          <w:numId w:val="1"/>
+        </w:numPr>
+        <w:tabs>
+          <w:tab w:val="clear" w:pos="1134"/>
+          <w:tab w:val="left" w:pos="709" w:leader="none"/>
+        </w:tabs>
+        <w:bidi w:val="0"/>
+        <w:ind w:hanging="283" w:start="709"/>
+        <w:jc w:val="start"/>
+        <w:rPr/>
+      </w:pPr>
+      <w:r>
+        <w:rPr/>
+        <w:t>Provide technical leadership through architecture, design discussions, project decomposition, mentoring, and engineering/QA coordination.</w:t>
+      </w:r>
+    </w:p>
+    <w:p>
+      <w:pPr>
+        <w:pStyle w:val="Heading3"/>
+        <w:keepLines/>
+        <w:bidi w:val="0"/>
+        <w:ind w:hanging="0" w:start="0" w:end="0"/>
+        <w:jc w:val="start"/>
+        <w:rPr/>
+      </w:pPr>
+      <w:r>
+        <w:rPr/>
+        <w:t>Vizient, Inc</w:t>
+      </w:r>
+    </w:p>
+    <w:p>
+      <w:pPr>
+        <w:pStyle w:val="BodyText"/>
+        <w:keepLines/>
+        <w:bidi w:val="0"/>
+        <w:jc w:val="start"/>
+        <w:rPr/>
+      </w:pPr>
+      <w:r>
+        <w:rPr>
+          <w:rStyle w:val="Strong"/>
         </w:rPr>
         <w:t>Senior Software Engineer</w:t>
       </w:r>
       <w:r>
-        <w:rPr>
-          <w:color w:val="536058"/>
-          <w:sz w:val="15"/>
-        </w:rPr>
+        <w:rPr/>
+        <w:t xml:space="preserve"> </w:t>
+      </w:r>
+    </w:p>
+    <w:p>
+      <w:pPr>
+        <w:pStyle w:val="BodyTextdate"/>
+        <w:keepLines/>
+        <w:bidi w:val="0"/>
+        <w:jc w:val="start"/>
+        <w:rPr/>
+      </w:pPr>
+      <w:r>
+        <w:rPr/>
         <w:t>June 2014 - December 2022 · Cape Girardeau, MO</w:t>
       </w:r>
     </w:p>
     <w:p>
       <w:pPr>
         <w:pStyle w:val="BodyText"/>
+        <w:keepLines/>
         <w:bidi w:val="0"/>
         <w:jc w:val="start"/>
         <w:rPr/>
@@ -674,321 +1006,479 @@
     </w:p>
     <w:p>
       <w:pPr>
-        <w:pStyle w:val="BodyText"/>
-        <w:numPr>
-          <w:ilvl w:val="0"/>
-          <w:numId w:val="2"/>
-        </w:numPr>
-        <w:tabs>
-          <w:tab w:val="clear" w:pos="1134"/>
-          <w:tab w:val="left" w:pos="709" w:leader="none"/>
-        </w:tabs>
-        <w:bidi w:val="0"/>
-        <w:spacing w:before="0" w:after="0"/>
-        <w:ind w:hanging="283" w:start="709"/>
-        <w:jc w:val="start"/>
-        <w:rPr/>
-      </w:pPr>
-      <w:r>
-        <w:rPr/>
-        <w:t>Led technical design and owned delivery across multiple initiatives, decomposing complex work, mentoring engineers, coordinating with QA, and setting implementation direction.</w:t>
-      </w:r>
-    </w:p>
-    <w:p>
-      <w:pPr>
-        <w:pStyle w:val="BodyText"/>
-        <w:numPr>
-          <w:ilvl w:val="0"/>
-          <w:numId w:val="2"/>
-        </w:numPr>
-        <w:tabs>
-          <w:tab w:val="clear" w:pos="1134"/>
-          <w:tab w:val="left" w:pos="709" w:leader="none"/>
-        </w:tabs>
-        <w:bidi w:val="0"/>
-        <w:spacing w:before="0" w:after="0"/>
-        <w:ind w:hanging="283" w:start="709"/>
-        <w:jc w:val="start"/>
-        <w:rPr/>
-      </w:pPr>
-      <w:r>
-        <w:rPr/>
-        <w:t>Built cloud spend and usage reporting that identified unnecessary services and optimization opportunities, contributing to approximately $30M in realized annual infrastructure savings.</w:t>
-      </w:r>
-    </w:p>
-    <w:p>
-      <w:pPr>
-        <w:pStyle w:val="BodyText"/>
-        <w:numPr>
-          <w:ilvl w:val="0"/>
-          <w:numId w:val="2"/>
-        </w:numPr>
-        <w:tabs>
-          <w:tab w:val="clear" w:pos="1134"/>
-          <w:tab w:val="left" w:pos="709" w:leader="none"/>
-        </w:tabs>
-        <w:bidi w:val="0"/>
-        <w:spacing w:before="0" w:after="0"/>
-        <w:ind w:hanging="283" w:start="709"/>
-        <w:jc w:val="start"/>
-        <w:rPr/>
-      </w:pPr>
-      <w:r>
-        <w:rPr/>
-        <w:t>Developed C#/.NET applications and backend services with Angular front ends and SQL Server data stores; designed Entity Framework migrations for greenfield Azure applications and contributed to Flyway-based legacy migrations.</w:t>
-      </w:r>
-    </w:p>
-    <w:p>
-      <w:pPr>
-        <w:pStyle w:val="BodyText"/>
-        <w:numPr>
-          <w:ilvl w:val="0"/>
-          <w:numId w:val="2"/>
-        </w:numPr>
-        <w:tabs>
-          <w:tab w:val="clear" w:pos="1134"/>
-          <w:tab w:val="left" w:pos="709" w:leader="none"/>
-        </w:tabs>
-        <w:bidi w:val="0"/>
-        <w:spacing w:before="0" w:after="0"/>
-        <w:ind w:hanging="283" w:start="709"/>
-        <w:jc w:val="start"/>
-        <w:rPr/>
-      </w:pPr>
-      <w:r>
-        <w:rPr/>
-        <w:t>Applied TDD with NUnit and xUnit across new features, bug fixes, and modernization, using unit, integration, end-to-end, and performance testing in local and CI validation; built Docker-based test environments for dependent services.</w:t>
-      </w:r>
-    </w:p>
-    <w:p>
-      <w:pPr>
-        <w:pStyle w:val="BodyText"/>
-        <w:numPr>
-          <w:ilvl w:val="0"/>
-          <w:numId w:val="2"/>
-        </w:numPr>
-        <w:tabs>
-          <w:tab w:val="clear" w:pos="1134"/>
-          <w:tab w:val="left" w:pos="709" w:leader="none"/>
-        </w:tabs>
-        <w:bidi w:val="0"/>
-        <w:spacing w:before="0" w:after="0"/>
-        <w:ind w:hanging="283" w:start="709"/>
-        <w:jc w:val="start"/>
-        <w:rPr/>
-      </w:pPr>
-      <w:r>
-        <w:rPr/>
-        <w:t>Improved backend and API performance, reducing select response times from several seconds to sub-second performance.</w:t>
-      </w:r>
-    </w:p>
-    <w:p>
-      <w:pPr>
-        <w:pStyle w:val="BodyText"/>
-        <w:numPr>
-          <w:ilvl w:val="0"/>
-          <w:numId w:val="2"/>
-        </w:numPr>
-        <w:tabs>
-          <w:tab w:val="clear" w:pos="1134"/>
-          <w:tab w:val="left" w:pos="709" w:leader="none"/>
-        </w:tabs>
-        <w:bidi w:val="0"/>
-        <w:spacing w:before="0" w:after="0"/>
-        <w:ind w:hanging="283" w:start="709"/>
-        <w:jc w:val="start"/>
-        <w:rPr/>
-      </w:pPr>
-      <w:r>
-        <w:rPr/>
-        <w:t>Built Azure-hosted applications using App Services, Azure SQL, Key Vault, Functions, Pulumi, and early Bicep; developed reusable infrastructure components and CI/CD automation for consistent provisioning and deployment.</w:t>
-      </w:r>
-    </w:p>
-    <w:p>
-      <w:pPr>
-        <w:pStyle w:val="BodyText"/>
-        <w:numPr>
-          <w:ilvl w:val="0"/>
-          <w:numId w:val="2"/>
-        </w:numPr>
-        <w:tabs>
-          <w:tab w:val="clear" w:pos="1134"/>
-          <w:tab w:val="left" w:pos="709" w:leader="none"/>
-        </w:tabs>
-        <w:bidi w:val="0"/>
-        <w:spacing w:before="0" w:after="0"/>
-        <w:ind w:hanging="283" w:start="709"/>
-        <w:jc w:val="start"/>
-        <w:rPr/>
-      </w:pPr>
-      <w:r>
-        <w:rPr/>
-        <w:t>Designed internal authentication services and OAuth/SSO integrations managing JWT lifecycle, roles and claims, service-to-service authentication, user management, Key Vault-backed secret rotation, API documentation, versioning, and backward compatibility.</w:t>
-      </w:r>
-    </w:p>
-    <w:p>
-      <w:pPr>
-        <w:pStyle w:val="BodyText"/>
-        <w:numPr>
-          <w:ilvl w:val="0"/>
-          <w:numId w:val="2"/>
-        </w:numPr>
-        <w:tabs>
-          <w:tab w:val="clear" w:pos="1134"/>
-          <w:tab w:val="left" w:pos="709" w:leader="none"/>
-        </w:tabs>
-        <w:bidi w:val="0"/>
-        <w:ind w:hanging="283" w:start="709"/>
-        <w:jc w:val="start"/>
-        <w:rPr/>
-      </w:pPr>
-      <w:r>
-        <w:rPr/>
-        <w:t>Designed and delivered a reporting system combining multiple domains and schemas, performing customer-specific transformations and processing datasets containing millions of records.</w:t>
-      </w:r>
-    </w:p>
-    <w:p>
-      <w:pPr>
-        <w:pStyle w:val="Heading3"/>
-        <w:bidi w:val="0"/>
-        <w:jc w:val="start"/>
-        <w:rPr/>
-      </w:pPr>
-      <w:r>
-        <w:rPr/>
-        <w:t>Southeast Missouri State University</w:t>
-      </w:r>
-    </w:p>
-    <w:p>
-      <w:pPr>
-        <w:pStyle w:val="BodyText"/>
-        <w:bidi w:val="0"/>
-        <w:spacing w:before="40" w:after="80"/>
-        <w:ind w:hanging="0" w:start="40" w:end="40"/>
+        <w:pStyle w:val="BodyTextrelevant"/>
+        <w:keepLines/>
+        <w:bidi w:val="0"/>
         <w:jc w:val="start"/>
         <w:rPr/>
       </w:pPr>
       <w:r>
         <w:rPr>
           <w:rStyle w:val="Strong"/>
-          <w:color w:val="536058"/>
-          <w:sz w:val="15"/>
+        </w:rPr>
+        <w:t>Relevant Skills:</w:t>
+      </w:r>
+      <w:r>
+        <w:rPr/>
+        <w:t xml:space="preserve"> C# in .NET, Microsoft Azure, Angular, Microsoft SQL Server, OAuth, Infrastructure as code (IaC), Continuous Integration and Continuous Delivery (CI/CD), Test-Driven Development</w:t>
+      </w:r>
+    </w:p>
+    <w:p>
+      <w:pPr>
+        <w:pStyle w:val="BodyText"/>
+        <w:keepLines/>
+        <w:numPr>
+          <w:ilvl w:val="0"/>
+          <w:numId w:val="2"/>
+        </w:numPr>
+        <w:tabs>
+          <w:tab w:val="clear" w:pos="1134"/>
+          <w:tab w:val="left" w:pos="709" w:leader="none"/>
+        </w:tabs>
+        <w:bidi w:val="0"/>
+        <w:spacing w:before="0" w:after="0"/>
+        <w:ind w:hanging="283" w:start="709"/>
+        <w:jc w:val="start"/>
+        <w:rPr/>
+      </w:pPr>
+      <w:r>
+        <w:rPr/>
+        <w:t>Led technical design and owned delivery across multiple initiatives, decomposing complex work, mentoring engineers, coordinating with QA, and setting implementation direction.</w:t>
+      </w:r>
+    </w:p>
+    <w:p>
+      <w:pPr>
+        <w:pStyle w:val="BodyText"/>
+        <w:keepLines/>
+        <w:numPr>
+          <w:ilvl w:val="0"/>
+          <w:numId w:val="2"/>
+        </w:numPr>
+        <w:tabs>
+          <w:tab w:val="clear" w:pos="1134"/>
+          <w:tab w:val="left" w:pos="709" w:leader="none"/>
+        </w:tabs>
+        <w:bidi w:val="0"/>
+        <w:spacing w:before="0" w:after="0"/>
+        <w:ind w:hanging="283" w:start="709"/>
+        <w:jc w:val="start"/>
+        <w:rPr/>
+      </w:pPr>
+      <w:r>
+        <w:rPr/>
+        <w:t>Architected and owned specialized projects end to end, serving as the primary technical owner for requirements, system design, implementation, deployment, and ongoing support.</w:t>
+      </w:r>
+    </w:p>
+    <w:p>
+      <w:pPr>
+        <w:pStyle w:val="BodyText"/>
+        <w:keepLines/>
+        <w:numPr>
+          <w:ilvl w:val="0"/>
+          <w:numId w:val="2"/>
+        </w:numPr>
+        <w:tabs>
+          <w:tab w:val="clear" w:pos="1134"/>
+          <w:tab w:val="left" w:pos="709" w:leader="none"/>
+        </w:tabs>
+        <w:bidi w:val="0"/>
+        <w:spacing w:before="0" w:after="0"/>
+        <w:ind w:hanging="283" w:start="709"/>
+        <w:jc w:val="start"/>
+        <w:rPr/>
+      </w:pPr>
+      <w:r>
+        <w:rPr/>
+        <w:t>Built cloud spend and usage reporting that identified unnecessary services and optimization opportunities, contributing to approximately $30M in realized annual infrastructure savings.</w:t>
+      </w:r>
+    </w:p>
+    <w:p>
+      <w:pPr>
+        <w:pStyle w:val="BodyText"/>
+        <w:keepLines/>
+        <w:numPr>
+          <w:ilvl w:val="0"/>
+          <w:numId w:val="2"/>
+        </w:numPr>
+        <w:tabs>
+          <w:tab w:val="clear" w:pos="1134"/>
+          <w:tab w:val="left" w:pos="709" w:leader="none"/>
+        </w:tabs>
+        <w:bidi w:val="0"/>
+        <w:spacing w:before="0" w:after="0"/>
+        <w:ind w:hanging="283" w:start="709"/>
+        <w:jc w:val="start"/>
+        <w:rPr/>
+      </w:pPr>
+      <w:r>
+        <w:rPr/>
+        <w:t>Developed C#/.NET applications and backend services across multiple generations of .NET, with Angular front ends and SQL Server data stores; designed Entity Framework migrations for greenfield Azure applications and contributed to Flyway-based legacy migrations.</w:t>
+      </w:r>
+    </w:p>
+    <w:p>
+      <w:pPr>
+        <w:pStyle w:val="BodyText"/>
+        <w:keepLines/>
+        <w:numPr>
+          <w:ilvl w:val="0"/>
+          <w:numId w:val="2"/>
+        </w:numPr>
+        <w:tabs>
+          <w:tab w:val="clear" w:pos="1134"/>
+          <w:tab w:val="left" w:pos="709" w:leader="none"/>
+        </w:tabs>
+        <w:bidi w:val="0"/>
+        <w:spacing w:before="0" w:after="0"/>
+        <w:ind w:hanging="283" w:start="709"/>
+        <w:jc w:val="start"/>
+        <w:rPr/>
+      </w:pPr>
+      <w:r>
+        <w:rPr/>
+        <w:t>Applied TDD with NUnit and xUnit across new features, bug fixes, and modernization, using unit, integration, end-to-end, and performance testing in local and CI validation; built Docker-based test environments for dependent services.</w:t>
+      </w:r>
+    </w:p>
+    <w:p>
+      <w:pPr>
+        <w:pStyle w:val="BodyText"/>
+        <w:keepLines/>
+        <w:numPr>
+          <w:ilvl w:val="0"/>
+          <w:numId w:val="2"/>
+        </w:numPr>
+        <w:tabs>
+          <w:tab w:val="clear" w:pos="1134"/>
+          <w:tab w:val="left" w:pos="709" w:leader="none"/>
+        </w:tabs>
+        <w:bidi w:val="0"/>
+        <w:spacing w:before="0" w:after="0"/>
+        <w:ind w:hanging="283" w:start="709"/>
+        <w:jc w:val="start"/>
+        <w:rPr/>
+      </w:pPr>
+      <w:r>
+        <w:rPr/>
+        <w:t>Improved backend and API performance, reducing select response times from several seconds to sub-second performance.</w:t>
+      </w:r>
+    </w:p>
+    <w:p>
+      <w:pPr>
+        <w:pStyle w:val="BodyText"/>
+        <w:keepLines/>
+        <w:numPr>
+          <w:ilvl w:val="0"/>
+          <w:numId w:val="2"/>
+        </w:numPr>
+        <w:tabs>
+          <w:tab w:val="clear" w:pos="1134"/>
+          <w:tab w:val="left" w:pos="709" w:leader="none"/>
+        </w:tabs>
+        <w:bidi w:val="0"/>
+        <w:spacing w:before="0" w:after="0"/>
+        <w:ind w:hanging="283" w:start="709"/>
+        <w:jc w:val="start"/>
+        <w:rPr/>
+      </w:pPr>
+      <w:r>
+        <w:rPr/>
+        <w:t>Built Azure-hosted applications using App Services, Azure SQL, Key Vault, Functions, Pulumi, and early Bicep.</w:t>
+      </w:r>
+    </w:p>
+    <w:p>
+      <w:pPr>
+        <w:pStyle w:val="BodyText"/>
+        <w:keepLines/>
+        <w:numPr>
+          <w:ilvl w:val="0"/>
+          <w:numId w:val="2"/>
+        </w:numPr>
+        <w:tabs>
+          <w:tab w:val="clear" w:pos="1134"/>
+          <w:tab w:val="left" w:pos="709" w:leader="none"/>
+        </w:tabs>
+        <w:bidi w:val="0"/>
+        <w:spacing w:before="0" w:after="0"/>
+        <w:ind w:hanging="283" w:start="709"/>
+        <w:jc w:val="start"/>
+        <w:rPr/>
+      </w:pPr>
+      <w:r>
+        <w:rPr/>
+        <w:t>Developed reusable infrastructure components and CI/CD automation to standardize application provisioning and deployment.</w:t>
+      </w:r>
+    </w:p>
+    <w:p>
+      <w:pPr>
+        <w:pStyle w:val="BodyText"/>
+        <w:keepLines/>
+        <w:numPr>
+          <w:ilvl w:val="0"/>
+          <w:numId w:val="2"/>
+        </w:numPr>
+        <w:tabs>
+          <w:tab w:val="clear" w:pos="1134"/>
+          <w:tab w:val="left" w:pos="709" w:leader="none"/>
+        </w:tabs>
+        <w:bidi w:val="0"/>
+        <w:spacing w:before="0" w:after="0"/>
+        <w:ind w:hanging="283" w:start="709"/>
+        <w:jc w:val="start"/>
+        <w:rPr/>
+      </w:pPr>
+      <w:r>
+        <w:rPr/>
+        <w:t>Designed internal authentication services and OAuth/SSO integrations managing JWT lifecycle, roles and claims, service-to-service authentication, user management, Key Vault-backed secret rotation, API documentation, versioning, and backward compatibility.</w:t>
+      </w:r>
+    </w:p>
+    <w:p>
+      <w:pPr>
+        <w:pStyle w:val="BodyText"/>
+        <w:keepLines/>
+        <w:numPr>
+          <w:ilvl w:val="0"/>
+          <w:numId w:val="2"/>
+        </w:numPr>
+        <w:tabs>
+          <w:tab w:val="clear" w:pos="1134"/>
+          <w:tab w:val="left" w:pos="709" w:leader="none"/>
+        </w:tabs>
+        <w:bidi w:val="0"/>
+        <w:ind w:hanging="283" w:start="709"/>
+        <w:jc w:val="start"/>
+        <w:rPr/>
+      </w:pPr>
+      <w:r>
+        <w:rPr/>
+        <w:t>Designed and delivered a reporting system combining multiple domains and schemas, performing extensive customer-specific transformations and processing datasets containing millions of records.</w:t>
+      </w:r>
+    </w:p>
+    <w:p>
+      <w:pPr>
+        <w:pStyle w:val="BodyTextpage-break"/>
+        <w:keepLines/>
+        <w:bidi w:val="0"/>
+        <w:jc w:val="start"/>
+        <w:rPr/>
+      </w:pPr>
+      <w:r>
+        <w:rPr/>
+        <w:t> </w:t>
+      </w:r>
+    </w:p>
+    <w:p>
+      <w:pPr>
+        <w:pStyle w:val="Heading3"/>
+        <w:keepLines/>
+        <w:bidi w:val="0"/>
+        <w:ind w:hanging="0" w:start="0" w:end="0"/>
+        <w:jc w:val="start"/>
+        <w:rPr/>
+      </w:pPr>
+      <w:r>
+        <w:rPr/>
+        <w:t>Southeast Missouri State University</w:t>
+      </w:r>
+    </w:p>
+    <w:p>
+      <w:pPr>
+        <w:pStyle w:val="BodyText"/>
+        <w:keepLines/>
+        <w:bidi w:val="0"/>
+        <w:jc w:val="start"/>
+        <w:rPr/>
+      </w:pPr>
+      <w:r>
+        <w:rPr>
+          <w:rStyle w:val="Strong"/>
         </w:rPr>
         <w:t>Teaching Assistant</w:t>
       </w:r>
       <w:r>
-        <w:rPr>
-          <w:color w:val="536058"/>
-          <w:sz w:val="15"/>
-        </w:rPr>
+        <w:rPr/>
+        <w:t xml:space="preserve"> </w:t>
+      </w:r>
+    </w:p>
+    <w:p>
+      <w:pPr>
+        <w:pStyle w:val="BodyTextdate"/>
+        <w:keepLines/>
+        <w:bidi w:val="0"/>
+        <w:jc w:val="start"/>
+        <w:rPr/>
+      </w:pPr>
+      <w:r>
+        <w:rPr/>
         <w:t>January 2015 - December 2015 · Cape Girardeau, MO</w:t>
       </w:r>
     </w:p>
     <w:p>
       <w:pPr>
         <w:pStyle w:val="BodyText"/>
-        <w:numPr>
-          <w:ilvl w:val="0"/>
-          <w:numId w:val="3"/>
-        </w:numPr>
-        <w:tabs>
-          <w:tab w:val="clear" w:pos="1134"/>
-          <w:tab w:val="left" w:pos="709" w:leader="none"/>
-        </w:tabs>
-        <w:bidi w:val="0"/>
-        <w:spacing w:before="0" w:after="0"/>
-        <w:ind w:hanging="283" w:start="709"/>
-        <w:jc w:val="start"/>
-        <w:rPr/>
-      </w:pPr>
-      <w:r>
-        <w:rPr/>
-        <w:t>Assisted faculty with Computer Science I, II, III, C and Unix, and Logic Fundamentals courses.</w:t>
-      </w:r>
-    </w:p>
-    <w:p>
-      <w:pPr>
-        <w:pStyle w:val="BodyText"/>
-        <w:numPr>
-          <w:ilvl w:val="0"/>
-          <w:numId w:val="3"/>
-        </w:numPr>
-        <w:tabs>
-          <w:tab w:val="clear" w:pos="1134"/>
-          <w:tab w:val="left" w:pos="709" w:leader="none"/>
-        </w:tabs>
-        <w:bidi w:val="0"/>
-        <w:spacing w:before="0" w:after="0"/>
-        <w:ind w:hanging="283" w:start="709"/>
-        <w:jc w:val="start"/>
-        <w:rPr/>
-      </w:pPr>
-      <w:r>
-        <w:rPr/>
-        <w:t>Helped students with programming concepts, debugging, coursework, and technical problem solving.</w:t>
-      </w:r>
-    </w:p>
-    <w:p>
-      <w:pPr>
-        <w:pStyle w:val="BodyText"/>
-        <w:numPr>
-          <w:ilvl w:val="0"/>
-          <w:numId w:val="3"/>
-        </w:numPr>
-        <w:tabs>
-          <w:tab w:val="clear" w:pos="1134"/>
-          <w:tab w:val="left" w:pos="709" w:leader="none"/>
-        </w:tabs>
-        <w:bidi w:val="0"/>
-        <w:ind w:hanging="283" w:start="709"/>
-        <w:jc w:val="start"/>
-        <w:rPr/>
-      </w:pPr>
-      <w:r>
-        <w:rPr/>
-        <w:t>Graded assignments and coursework, provided feedback to students, and assisted with exam proctoring.</w:t>
-      </w:r>
-    </w:p>
-    <w:p>
-      <w:pPr>
-        <w:pStyle w:val="Heading3"/>
-        <w:bidi w:val="0"/>
-        <w:jc w:val="start"/>
-        <w:rPr/>
-      </w:pPr>
-      <w:r>
-        <w:rPr/>
-        <w:t>Southeast Missouri State University</w:t>
-      </w:r>
-    </w:p>
-    <w:p>
-      <w:pPr>
-        <w:pStyle w:val="BodyText"/>
-        <w:bidi w:val="0"/>
-        <w:spacing w:before="40" w:after="80"/>
-        <w:ind w:hanging="0" w:start="40" w:end="40"/>
+        <w:keepLines/>
+        <w:bidi w:val="0"/>
+        <w:jc w:val="start"/>
+        <w:rPr/>
+      </w:pPr>
+      <w:r>
+        <w:rPr/>
+        <w:t>Supported faculty and students across introductory computer science and foundational technical coursework.</w:t>
+      </w:r>
+    </w:p>
+    <w:p>
+      <w:pPr>
+        <w:pStyle w:val="BodyTextrelevant"/>
+        <w:keepLines/>
+        <w:bidi w:val="0"/>
         <w:jc w:val="start"/>
         <w:rPr/>
       </w:pPr>
       <w:r>
         <w:rPr>
           <w:rStyle w:val="Strong"/>
-          <w:color w:val="536058"/>
-          <w:sz w:val="15"/>
+        </w:rPr>
+        <w:t>Relevant Skills:</w:t>
+      </w:r>
+      <w:r>
+        <w:rPr/>
+        <w:t xml:space="preserve"> C (Programming Language), Linux, Classroom Instruction, Mentoring, Java, Public Speaking</w:t>
+      </w:r>
+    </w:p>
+    <w:p>
+      <w:pPr>
+        <w:pStyle w:val="BodyText"/>
+        <w:keepLines/>
+        <w:numPr>
+          <w:ilvl w:val="0"/>
+          <w:numId w:val="3"/>
+        </w:numPr>
+        <w:tabs>
+          <w:tab w:val="clear" w:pos="1134"/>
+          <w:tab w:val="left" w:pos="709" w:leader="none"/>
+        </w:tabs>
+        <w:bidi w:val="0"/>
+        <w:spacing w:before="0" w:after="0"/>
+        <w:ind w:hanging="283" w:start="709"/>
+        <w:jc w:val="start"/>
+        <w:rPr/>
+      </w:pPr>
+      <w:r>
+        <w:rPr/>
+        <w:t>Assisted faculty with instructional delivery for Computer Science I, II, III, C and Unix, and Logic Fundamentals courses.</w:t>
+      </w:r>
+    </w:p>
+    <w:p>
+      <w:pPr>
+        <w:pStyle w:val="BodyText"/>
+        <w:keepLines/>
+        <w:numPr>
+          <w:ilvl w:val="0"/>
+          <w:numId w:val="3"/>
+        </w:numPr>
+        <w:tabs>
+          <w:tab w:val="clear" w:pos="1134"/>
+          <w:tab w:val="left" w:pos="709" w:leader="none"/>
+        </w:tabs>
+        <w:bidi w:val="0"/>
+        <w:spacing w:before="0" w:after="0"/>
+        <w:ind w:hanging="283" w:start="709"/>
+        <w:jc w:val="start"/>
+        <w:rPr/>
+      </w:pPr>
+      <w:r>
+        <w:rPr/>
+        <w:t>Provided one-on-one support for programming concepts, debugging, coursework, and technical problem solving.</w:t>
+      </w:r>
+    </w:p>
+    <w:p>
+      <w:pPr>
+        <w:pStyle w:val="BodyText"/>
+        <w:keepLines/>
+        <w:numPr>
+          <w:ilvl w:val="0"/>
+          <w:numId w:val="3"/>
+        </w:numPr>
+        <w:tabs>
+          <w:tab w:val="clear" w:pos="1134"/>
+          <w:tab w:val="left" w:pos="709" w:leader="none"/>
+        </w:tabs>
+        <w:bidi w:val="0"/>
+        <w:ind w:hanging="283" w:start="709"/>
+        <w:jc w:val="start"/>
+        <w:rPr/>
+      </w:pPr>
+      <w:r>
+        <w:rPr/>
+        <w:t>Supported course operations by grading assignments and coursework, providing feedback to students, and assisting with exam proctoring.</w:t>
+      </w:r>
+    </w:p>
+    <w:p>
+      <w:pPr>
+        <w:pStyle w:val="BodyText"/>
+        <w:keepLines/>
+        <w:bidi w:val="0"/>
+        <w:jc w:val="start"/>
+        <w:rPr/>
+      </w:pPr>
+      <w:r>
+        <w:rPr>
+          <w:rStyle w:val="Strong"/>
         </w:rPr>
         <w:t>WebParaprofessional</w:t>
       </w:r>
       <w:r>
+        <w:rPr/>
+        <w:t xml:space="preserve"> </w:t>
+      </w:r>
+    </w:p>
+    <w:p>
+      <w:pPr>
+        <w:pStyle w:val="BodyTextdate"/>
+        <w:keepLines/>
+        <w:bidi w:val="0"/>
+        <w:jc w:val="start"/>
+        <w:rPr/>
+      </w:pPr>
+      <w:r>
+        <w:rPr/>
+        <w:t>January 2014 - May 2015 · Cape Girardeau, MO</w:t>
+      </w:r>
+    </w:p>
+    <w:p>
+      <w:pPr>
+        <w:pStyle w:val="BodyText"/>
+        <w:keepLines/>
+        <w:bidi w:val="0"/>
+        <w:jc w:val="start"/>
+        <w:rPr/>
+      </w:pPr>
+      <w:r>
+        <w:rPr/>
+        <w:t>Supported university departments and instructional technology through custom web applications, platform administration, and multimedia content.</w:t>
+      </w:r>
+    </w:p>
+    <w:p>
+      <w:pPr>
+        <w:pStyle w:val="BodyTextrelevant"/>
+        <w:keepLines/>
+        <w:bidi w:val="0"/>
+        <w:jc w:val="start"/>
+        <w:rPr/>
+      </w:pPr>
+      <w:r>
         <w:rPr>
-          <w:color w:val="536058"/>
-          <w:sz w:val="15"/>
+          <w:rStyle w:val="Strong"/>
         </w:rPr>
-        <w:t>January 2014 - May 2015 · Cape Girardeau, MO</w:t>
-      </w:r>
-    </w:p>
-    <w:p>
-      <w:pPr>
-        <w:pStyle w:val="BodyText"/>
+        <w:t>Relevant Skills:</w:t>
+      </w:r>
+      <w:r>
+        <w:rPr/>
+        <w:t xml:space="preserve"> C# in .NET, ASP.NET, Microsoft SQL Server, Entity Framework, Internet Information Services (IIS), Moodle, HTML/CSS</w:t>
+      </w:r>
+    </w:p>
+    <w:p>
+      <w:pPr>
+        <w:pStyle w:val="BodyText"/>
+        <w:keepLines/>
         <w:numPr>
           <w:ilvl w:val="0"/>
           <w:numId w:val="4"/>
@@ -1011,6 +1501,7 @@
     <w:p>
       <w:pPr>
         <w:pStyle w:val="BodyText"/>
+        <w:keepLines/>
         <w:numPr>
           <w:ilvl w:val="0"/>
           <w:numId w:val="4"/>
@@ -1027,12 +1518,13 @@
       </w:pPr>
       <w:r>
         <w:rPr/>
-        <w:t>Designed and built an end to end sign-in and usage-tracking application for the university writing lab.</w:t>
-      </w:r>
-    </w:p>
-    <w:p>
-      <w:pPr>
-        <w:pStyle w:val="BodyText"/>
+        <w:t>Designed and built an end-to-end sign-in and usage-tracking application supporting the university writing lab.</w:t>
+      </w:r>
+    </w:p>
+    <w:p>
+      <w:pPr>
+        <w:pStyle w:val="BodyText"/>
+        <w:keepLines/>
         <w:numPr>
           <w:ilvl w:val="0"/>
           <w:numId w:val="4"/>
@@ -1055,6 +1547,7 @@
     <w:p>
       <w:pPr>
         <w:pStyle w:val="BodyText"/>
+        <w:keepLines/>
         <w:numPr>
           <w:ilvl w:val="0"/>
           <w:numId w:val="4"/>
@@ -1076,6 +1569,7 @@
     <w:p>
       <w:pPr>
         <w:pStyle w:val="Heading2"/>
+        <w:keepLines/>
         <w:bidi w:val="0"/>
         <w:jc w:val="start"/>
         <w:rPr/>
@@ -1088,6 +1582,7 @@
     <w:p>
       <w:pPr>
         <w:pStyle w:val="BodyText"/>
+        <w:keepLines/>
         <w:bidi w:val="0"/>
         <w:jc w:val="start"/>
         <w:rPr/>
@@ -1105,7 +1600,8 @@
     </w:p>
     <w:p>
       <w:pPr>
-        <w:pStyle w:val="BodyText"/>
+        <w:pStyle w:val="BodyTextdate"/>
+        <w:keepLines/>
         <w:bidi w:val="0"/>
         <w:jc w:val="start"/>
         <w:rPr/>
@@ -1118,6 +1614,7 @@
     <w:p>
       <w:pPr>
         <w:pStyle w:val="Heading2"/>
+        <w:keepLines/>
         <w:bidi w:val="0"/>
         <w:jc w:val="start"/>
         <w:rPr/>
@@ -1130,26 +1627,60 @@
     <w:p>
       <w:pPr>
         <w:pStyle w:val="BodyText"/>
-        <w:bidi w:val="0"/>
-        <w:spacing w:before="0" w:after="80"/>
-        <w:jc w:val="start"/>
-        <w:rPr/>
-      </w:pPr>
+        <w:keepLines/>
+        <w:bidi w:val="0"/>
+        <w:spacing w:before="0" w:after="100"/>
+        <w:jc w:val="start"/>
+        <w:rPr/>
+      </w:pPr>
+      <w:hyperlink r:id="rId10">
+        <w:r>
+          <w:rPr>
+            <w:rStyle w:val="Hyperlink"/>
+            <w:b/>
+            <w:bCs/>
+          </w:rPr>
+          <w:t>Azure Fundamentals ↗</w:t>
+        </w:r>
+      </w:hyperlink>
       <w:r>
         <w:rPr>
-          <w:rStyle w:val="Strong"/>
+          <w:rStyle w:val="Hyperlink"/>
+          <w:b/>
+          <w:bCs/>
         </w:rPr>
-        <w:t>Azure Fundamentals</w:t>
+        <w:t xml:space="preserve"> </w:t>
+      </w:r>
+      <w:r>
+        <w:rPr>
+          <w:rStyle w:val="Hyperlink"/>
+          <w:rFonts w:eastAsia="Arial;Helvetica;sans-serif" w:cs="Arial;Helvetica;sans-serif"/>
+          <w:color w:val="536058"/>
+          <w:sz w:val="16"/>
+          <w:szCs w:val="16"/>
+          <w:lang w:val="en-US" w:eastAsia="zh-CN" w:bidi="hi-IN"/>
+        </w:rPr>
+        <w:t xml:space="preserve">- </w:t>
+      </w:r>
+      <w:r>
+        <w:rPr>
+          <w:rFonts w:eastAsia="Arial;Helvetica;sans-serif" w:cs="Arial;Helvetica;sans-serif"/>
+          <w:color w:val="536058"/>
+          <w:sz w:val="16"/>
+          <w:szCs w:val="16"/>
+          <w:lang w:val="en-US" w:eastAsia="zh-CN" w:bidi="hi-IN"/>
+        </w:rPr>
+        <w:t>December 2021</w:t>
       </w:r>
     </w:p>
     <w:sectPr>
       <w:type w:val="nextPage"/>
-      <w:pgSz w:w="11906" w:h="16838"/>
+      <w:pgSz w:w="12240" w:h="15840"/>
       <w:pgMar w:left="1134" w:right="567" w:gutter="0" w:header="0" w:top="567" w:footer="0" w:bottom="567"/>
       <w:pgNumType w:fmt="decimal"/>
       <w:formProt w:val="false"/>
       <w:textDirection w:val="lrTb"/>
-      <w:docGrid w:type="default" w:linePitch="600" w:charSpace="32768"/>
+      <w:docGrid w:type="default" w:linePitch="600" w:charSpace="46079"/>
     </w:sectPr>
   </w:body>
 </w:document>
@@ -1722,7 +2253,6 @@
     <w:lvl w:ilvl="1">
       <w:start w:val="1"/>
       <w:numFmt w:val="none"/>
-      <w:pStyle w:val="Heading2"/>
       <w:suff w:val="nothing"/>
       <w:lvlText w:val=""/>
       <w:lvlJc w:val="start"/>
@@ -1736,7 +2266,6 @@
     <w:lvl w:ilvl="2">
       <w:start w:val="1"/>
       <w:numFmt w:val="none"/>
-      <w:pStyle w:val="Heading3"/>
       <w:suff w:val="nothing"/>
       <w:lvlText w:val=""/>
       <w:lvlJc w:val="start"/>
@@ -1866,13 +2395,17 @@
     <w:qFormat/>
     <w:pPr>
       <w:widowControl w:val="false"/>
+      <w:suppressAutoHyphens w:val="true"/>
       <w:bidi w:val="0"/>
+      <w:spacing w:lineRule="auto" w:line="314" w:before="0" w:after="0"/>
+      <w:jc w:val="start"/>
     </w:pPr>
     <w:rPr>
-      <w:rFonts w:ascii="Liberation Serif" w:hAnsi="Liberation Serif" w:eastAsia="Noto Serif CJK SC" w:cs="Noto Sans Devanagari"/>
-      <w:color w:val="auto"/>
-      <w:sz w:val="24"/>
-      <w:szCs w:val="24"/>
+      <w:rFonts w:ascii="Arial;Helvetica;sans-serif" w:hAnsi="Arial;Helvetica;sans-serif" w:eastAsia="Arial;Helvetica;sans-serif" w:cs="Arial;Helvetica;sans-serif"/>
+      <w:color w:val="1F2923"/>
+      <w:kern w:val="0"/>
+      <w:sz w:val="17"/>
+      <w:szCs w:val="17"/>
       <w:lang w:val="en-US" w:eastAsia="zh-CN" w:bidi="hi-IN"/>
     </w:rPr>
   </w:style>
@@ -1883,7 +2416,7 @@
     <w:qFormat/>
     <w:pPr/>
     <w:rPr>
-      <w:rFonts w:ascii="IBM Plex Serif;Georgia;serif" w:hAnsi="IBM Plex Serif;Georgia;serif" w:eastAsia="IBM Plex Serif;Georgia;serif" w:cs="IBM Plex Serif;Georgia;serif"/>
+      <w:rFonts w:ascii="Georgia;serif" w:hAnsi="Georgia;serif" w:eastAsia="Georgia;serif" w:cs="Georgia;serif"/>
       <w:b/>
       <w:bCs/>
       <w:color w:val="173F32"/>
@@ -1897,16 +2430,21 @@
     <w:next w:val="BodyText"/>
     <w:qFormat/>
     <w:pPr>
-      <w:pBdr/>
-      <w:spacing w:before="200" w:after="120"/>
+      <w:keepNext w:val="true"/>
+      <w:pBdr>
+        <w:top w:val="single" w:sz="2" w:space="3" w:color="849188"/>
+      </w:pBdr>
+      <w:spacing w:before="220" w:after="80"/>
+      <w:ind w:start="220" w:end="220"/>
       <w:outlineLvl w:val="1"/>
     </w:pPr>
     <w:rPr>
-      <w:rFonts w:ascii="Liberation Serif" w:hAnsi="Liberation Serif" w:eastAsia="Noto Serif CJK SC" w:cs="Noto Sans Devanagari"/>
+      <w:rFonts w:ascii="Georgia;serif" w:hAnsi="Georgia;serif" w:eastAsia="Georgia;serif" w:cs="Georgia;serif"/>
       <w:b/>
       <w:bCs/>
-      <w:sz w:val="36"/>
-      <w:szCs w:val="36"/>
+      <w:color w:val="173F32"/>
+      <w:sz w:val="32"/>
+      <w:szCs w:val="32"/>
     </w:rPr>
   </w:style>
   <w:style w:type="paragraph" w:styleId="Heading3">
@@ -1915,11 +2453,12 @@
     <w:next w:val="BodyText"/>
     <w:qFormat/>
     <w:pPr>
-      <w:spacing w:lineRule="auto" w:line="252" w:before="140" w:after="120"/>
+      <w:spacing w:before="200" w:after="20"/>
+      <w:ind w:start="200" w:end="200"/>
       <w:outlineLvl w:val="2"/>
     </w:pPr>
     <w:rPr>
-      <w:rFonts w:ascii="IBM Plex Serif;Georgia;serif" w:hAnsi="IBM Plex Serif;Georgia;serif" w:eastAsia="IBM Plex Serif;Georgia;serif" w:cs="IBM Plex Serif;Georgia;serif"/>
+      <w:rFonts w:ascii="Georgia;serif" w:hAnsi="Georgia;serif" w:eastAsia="Georgia;serif" w:cs="Georgia;serif"/>
       <w:b/>
       <w:bCs/>
       <w:color w:val="173F32"/>
@@ -1927,8 +2466,22 @@
       <w:szCs w:val="25"/>
     </w:rPr>
   </w:style>
+  <w:style w:type="character" w:styleId="EndnoteCharacters">
+    <w:name w:val="Endnote Characters"/>
+    <w:qFormat/>
+    <w:rPr>
+      <w:vertAlign w:val="superscript"/>
+    </w:rPr>
+  </w:style>
   <w:style w:type="character" w:styleId="EndnoteReference">
     <w:name w:val="endnote reference"/>
+    <w:rPr>
+      <w:vertAlign w:val="superscript"/>
+    </w:rPr>
+  </w:style>
+  <w:style w:type="character" w:styleId="FootnoteCharacters">
+    <w:name w:val="Footnote Characters"/>
+    <w:qFormat/>
     <w:rPr>
       <w:vertAlign w:val="superscript"/>
     </w:rPr>
@@ -1939,13 +2492,13 @@
       <w:vertAlign w:val="superscript"/>
     </w:rPr>
   </w:style>
-  <w:style w:type="character" w:styleId="EndnoteCharacters">
-    <w:name w:val="Endnote Characters"/>
+  <w:style w:type="character" w:styleId="EndnoteCharactersuser">
+    <w:name w:val="Endnote Characters (user)"/>
     <w:qFormat/>
     <w:rPr/>
   </w:style>
-  <w:style w:type="character" w:styleId="FootnoteCharacters">
-    <w:name w:val="Footnote Characters"/>
+  <w:style w:type="character" w:styleId="FootnoteCharactersuser">
+    <w:name w:val="Footnote Characters (user)"/>
     <w:qFormat/>
     <w:rPr/>
   </w:style>
@@ -1959,22 +2512,6 @@
       <w:effect w:val="none"/>
     </w:rPr>
   </w:style>
-  <w:style w:type="character" w:styleId="Strong">
-    <w:name w:val="Strong"/>
-    <w:qFormat/>
-    <w:rPr>
-      <w:b/>
-      <w:bCs/>
-      <w:color w:val="173F32"/>
-    </w:rPr>
-  </w:style>
-  <w:style w:type="character" w:styleId="Bullets">
-    <w:name w:val="Bullets"/>
-    <w:qFormat/>
-    <w:rPr>
-      <w:rFonts w:ascii="OpenSymbol" w:hAnsi="OpenSymbol" w:eastAsia="OpenSymbol" w:cs="OpenSymbol"/>
-    </w:rPr>
-  </w:style>
   <w:style w:type="character" w:styleId="FollowedHyperlink">
     <w:name w:val="FollowedHyperlink"/>
     <w:rPr>
@@ -1983,6 +2520,79 @@
       <w:color w:val="800000"/>
       <w:u w:val="none"/>
       <w:effect w:val="none"/>
+    </w:rPr>
+  </w:style>
+  <w:style w:type="character" w:styleId="Strong">
+    <w:name w:val="Strong"/>
+    <w:qFormat/>
+    <w:rPr>
+      <w:b/>
+      <w:bCs/>
+    </w:rPr>
+  </w:style>
+  <w:style w:type="character" w:styleId="Bulletsuser">
+    <w:name w:val="Bullets (user)"/>
+    <w:qFormat/>
+    <w:rPr>
+      <w:rFonts w:ascii="OpenSymbol" w:hAnsi="OpenSymbol" w:eastAsia="OpenSymbol" w:cs="OpenSymbol"/>
+    </w:rPr>
+  </w:style>
+  <w:style w:type="paragraph" w:styleId="Heading">
+    <w:name w:val="Heading"/>
+    <w:basedOn w:val="Normal"/>
+    <w:next w:val="BodyText"/>
+    <w:qFormat/>
+    <w:pPr>
+      <w:keepNext w:val="true"/>
+      <w:spacing w:before="240" w:after="283"/>
+    </w:pPr>
+    <w:rPr>
+      <w:rFonts w:ascii="Liberation Sans" w:hAnsi="Liberation Sans"/>
+      <w:sz w:val="28"/>
+      <w:szCs w:val="28"/>
+    </w:rPr>
+  </w:style>
+  <w:style w:type="paragraph" w:styleId="BodyText">
+    <w:name w:val="Body Text"/>
+    <w:basedOn w:val="Normal"/>
+    <w:pPr>
+      <w:spacing w:before="0" w:after="100"/>
+    </w:pPr>
+    <w:rPr/>
+  </w:style>
+  <w:style w:type="paragraph" w:styleId="List">
+    <w:name w:val="List"/>
+    <w:basedOn w:val="BodyText"/>
+    <w:pPr/>
+    <w:rPr>
+      <w:rFonts w:cs="Noto Sans Devanagari"/>
+    </w:rPr>
+  </w:style>
+  <w:style w:type="paragraph" w:styleId="Caption">
+    <w:name w:val="caption"/>
+    <w:basedOn w:val="Normal"/>
+    <w:qFormat/>
+    <w:pPr>
+      <w:suppressLineNumbers/>
+      <w:spacing w:before="120" w:after="120"/>
+    </w:pPr>
+    <w:rPr>
+      <w:rFonts w:cs="Noto Sans Devanagari"/>
+      <w:i/>
+      <w:iCs/>
+      <w:sz w:val="24"/>
+      <w:szCs w:val="24"/>
+    </w:rPr>
+  </w:style>
+  <w:style w:type="paragraph" w:styleId="Index">
+    <w:name w:val="Index"/>
+    <w:basedOn w:val="Normal"/>
+    <w:qFormat/>
+    <w:pPr>
+      <w:suppressLineNumbers/>
+    </w:pPr>
+    <w:rPr>
+      <w:rFonts w:cs="Noto Sans Devanagari"/>
     </w:rPr>
   </w:style>
   <w:style w:type="paragraph" w:styleId="HorizontalLine">
@@ -2015,64 +2625,6 @@
     <w:pPr/>
     <w:rPr/>
   </w:style>
-  <w:style w:type="paragraph" w:styleId="Index">
-    <w:name w:val="Index"/>
-    <w:basedOn w:val="Normal"/>
-    <w:qFormat/>
-    <w:pPr>
-      <w:suppressLineNumbers/>
-    </w:pPr>
-    <w:rPr>
-      <w:rFonts w:cs="Noto Sans Devanagari"/>
-    </w:rPr>
-  </w:style>
-  <w:style w:type="paragraph" w:styleId="Caption">
-    <w:name w:val="caption"/>
-    <w:basedOn w:val="Normal"/>
-    <w:qFormat/>
-    <w:pPr>
-      <w:suppressLineNumbers/>
-      <w:spacing w:before="120" w:after="120"/>
-    </w:pPr>
-    <w:rPr>
-      <w:rFonts w:cs="Noto Sans Devanagari"/>
-      <w:i/>
-      <w:iCs/>
-      <w:sz w:val="24"/>
-      <w:szCs w:val="24"/>
-    </w:rPr>
-  </w:style>
-  <w:style w:type="paragraph" w:styleId="List">
-    <w:name w:val="List"/>
-    <w:basedOn w:val="BodyText"/>
-    <w:pPr/>
-    <w:rPr>
-      <w:rFonts w:cs="Noto Sans Devanagari"/>
-    </w:rPr>
-  </w:style>
-  <w:style w:type="paragraph" w:styleId="BodyText">
-    <w:name w:val="Body Text"/>
-    <w:basedOn w:val="Normal"/>
-    <w:pPr>
-      <w:spacing w:before="0" w:after="80"/>
-    </w:pPr>
-    <w:rPr/>
-  </w:style>
-  <w:style w:type="paragraph" w:styleId="Heading">
-    <w:name w:val="Heading"/>
-    <w:basedOn w:val="Normal"/>
-    <w:next w:val="BodyText"/>
-    <w:qFormat/>
-    <w:pPr>
-      <w:keepNext w:val="true"/>
-      <w:spacing w:before="240" w:after="283"/>
-    </w:pPr>
-    <w:rPr>
-      <w:rFonts w:ascii="Liberation Sans" w:hAnsi="Liberation Sans"/>
-      <w:sz w:val="28"/>
-      <w:szCs w:val="28"/>
-    </w:rPr>
-  </w:style>
   <w:style w:type="paragraph" w:styleId="TableHeading">
     <w:name w:val="Table Heading"/>
     <w:basedOn w:val="TableContents"/>
@@ -2086,17 +2638,41 @@
       <w:bCs/>
     </w:rPr>
   </w:style>
-  <w:style w:type="paragraph" w:styleId="BodyTextskill">
-    <w:name w:val="Body Text.skill"/>
+  <w:style w:type="paragraph" w:styleId="BodyTextdate">
+    <w:name w:val="Body Text.date"/>
     <w:basedOn w:val="BodyText"/>
     <w:qFormat/>
     <w:pPr>
-      <w:spacing w:lineRule="auto" w:line="310" w:before="0" w:after="80"/>
+      <w:spacing w:before="0" w:after="100"/>
     </w:pPr>
     <w:rPr>
-      <w:sz w:val="15"/>
-      <w:szCs w:val="15"/>
+      <w:color w:val="536058"/>
+      <w:sz w:val="16"/>
+      <w:szCs w:val="16"/>
     </w:rPr>
+  </w:style>
+  <w:style w:type="paragraph" w:styleId="BodyTextrelevant">
+    <w:name w:val="Body Text.relevant"/>
+    <w:basedOn w:val="BodyText"/>
+    <w:qFormat/>
+    <w:pPr>
+      <w:spacing w:lineRule="auto" w:line="312" w:before="40" w:after="60"/>
+      <w:ind w:start="40" w:end="40"/>
+    </w:pPr>
+    <w:rPr>
+      <w:color w:val="2F6752"/>
+      <w:sz w:val="16"/>
+      <w:szCs w:val="16"/>
+    </w:rPr>
+  </w:style>
+  <w:style w:type="paragraph" w:styleId="BodyTextpage-break">
+    <w:name w:val="Body Text.page-break"/>
+    <w:basedOn w:val="BodyText"/>
+    <w:qFormat/>
+    <w:pPr>
+      <w:pageBreakBefore/>
+    </w:pPr>
+    <w:rPr/>
   </w:style>
 </w:styles>
 </file>

</xml_diff>

<commit_message>
Update portfolio scale metrics, AI messaging, certifications, and resume content.
</commit_message>
<xml_diff>
--- a/assets/documents/Kirk_Tolleshaug_Resume.docx
+++ b/assets/documents/Kirk_Tolleshaug_Resume.docx
@@ -29,8 +29,8 @@
           </w:tcPr>
           <w:p>
             <w:pPr>
+              <w:keepLines/>
               <w:pStyle w:val="TableContents"/>
-              <w:keepLines/>
               <w:bidi w:val="0"/>
               <w:spacing w:before="0" w:after="100"/>
               <w:jc w:val="start"/>
@@ -87,8 +87,8 @@
           </w:tcPr>
           <w:p>
             <w:pPr>
+              <w:keepLines/>
               <w:pStyle w:val="Heading1"/>
-              <w:keepLines/>
               <w:bidi w:val="0"/>
               <w:spacing w:before="240" w:after="283"/>
               <w:jc w:val="start"/>
@@ -104,8 +104,8 @@
     </w:tbl>
     <w:p>
       <w:pPr>
-        <w:pStyle w:val="BodyText"/>
-        <w:keepLines/>
+        <w:keepLines/>
+        <w:pStyle w:val="BodyText"/>
         <w:bidi w:val="0"/>
         <w:spacing w:before="60" w:after="60"/>
         <w:ind w:hanging="0" w:start="680" w:end="60"/>
@@ -127,8 +127,8 @@
     </w:p>
     <w:p>
       <w:pPr>
-        <w:pStyle w:val="BodyText"/>
-        <w:keepLines/>
+        <w:keepLines/>
+        <w:pStyle w:val="BodyText"/>
         <w:bidi w:val="0"/>
         <w:spacing w:before="80" w:after="80"/>
         <w:ind w:hanging="0" w:start="80" w:end="80"/>
@@ -136,7 +136,9 @@
         <w:rPr/>
       </w:pPr>
       <w:r>
-        <w:rPr/>
+        <w:rPr>
+          <w:color w:val="536058"/>
+        </w:rPr>
         <w:drawing>
           <wp:inline distT="0" distB="0" distL="0" distR="0">
             <wp:extent cx="101600" cy="101600"/>
@@ -184,7 +186,10 @@
         <w:t xml:space="preserve">Vancouver, Washington, United States · </w:t>
       </w:r>
       <w:r>
-        <w:rPr/>
+        <w:rPr>
+          <w:color w:val="536058"/>
+          <w:sz w:val="15"/>
+        </w:rPr>
         <w:drawing>
           <wp:inline distT="0" distB="0" distL="0" distR="0">
             <wp:extent cx="101600" cy="101600"/>
@@ -242,7 +247,10 @@
         <w:t xml:space="preserve"> · </w:t>
       </w:r>
       <w:r>
-        <w:rPr/>
+        <w:rPr>
+          <w:color w:val="536058"/>
+          <w:sz w:val="15"/>
+        </w:rPr>
         <w:drawing>
           <wp:inline distT="0" distB="0" distL="0" distR="0">
             <wp:extent cx="101600" cy="101600"/>
@@ -300,7 +308,10 @@
         <w:t xml:space="preserve"> · </w:t>
       </w:r>
       <w:r>
-        <w:rPr/>
+        <w:rPr>
+          <w:color w:val="536058"/>
+          <w:sz w:val="15"/>
+        </w:rPr>
         <w:drawing>
           <wp:inline distT="0" distB="0" distL="0" distR="0">
             <wp:extent cx="101600" cy="101600"/>
@@ -353,8 +364,8 @@
     </w:p>
     <w:p>
       <w:pPr>
+        <w:keepLines/>
         <w:pStyle w:val="Heading2"/>
-        <w:keepLines/>
         <w:bidi w:val="0"/>
         <w:jc w:val="start"/>
         <w:rPr/>
@@ -366,8 +377,8 @@
     </w:p>
     <w:p>
       <w:pPr>
-        <w:pStyle w:val="BodyText"/>
-        <w:keepLines/>
+        <w:keepLines/>
+        <w:pStyle w:val="BodyText"/>
         <w:bidi w:val="0"/>
         <w:jc w:val="start"/>
         <w:rPr/>
@@ -379,8 +390,8 @@
     </w:p>
     <w:p>
       <w:pPr>
-        <w:pStyle w:val="BodyText"/>
-        <w:keepLines/>
+        <w:keepLines/>
+        <w:pStyle w:val="BodyText"/>
         <w:bidi w:val="0"/>
         <w:jc w:val="start"/>
         <w:rPr/>
@@ -392,8 +403,8 @@
     </w:p>
     <w:p>
       <w:pPr>
-        <w:pStyle w:val="BodyText"/>
-        <w:keepLines/>
+        <w:keepLines/>
+        <w:pStyle w:val="BodyText"/>
         <w:bidi w:val="0"/>
         <w:jc w:val="start"/>
         <w:rPr/>
@@ -405,8 +416,8 @@
     </w:p>
     <w:p>
       <w:pPr>
-        <w:pStyle w:val="BodyText"/>
-        <w:keepLines/>
+        <w:keepLines/>
+        <w:pStyle w:val="BodyText"/>
         <w:bidi w:val="0"/>
         <w:jc w:val="start"/>
         <w:rPr/>
@@ -418,8 +429,8 @@
     </w:p>
     <w:p>
       <w:pPr>
-        <w:pStyle w:val="BodyText"/>
-        <w:keepLines/>
+        <w:keepLines/>
+        <w:pStyle w:val="BodyText"/>
         <w:bidi w:val="0"/>
         <w:jc w:val="start"/>
         <w:rPr/>
@@ -431,8 +442,8 @@
     </w:p>
     <w:p>
       <w:pPr>
+        <w:keepLines/>
         <w:pStyle w:val="Heading2"/>
-        <w:keepLines/>
         <w:bidi w:val="0"/>
         <w:jc w:val="start"/>
         <w:rPr/>
@@ -444,8 +455,8 @@
     </w:p>
     <w:p>
       <w:pPr>
-        <w:pStyle w:val="BodyText"/>
-        <w:keepLines/>
+        <w:keepLines/>
+        <w:pStyle w:val="BodyText"/>
         <w:bidi w:val="0"/>
         <w:jc w:val="start"/>
         <w:rPr/>
@@ -463,8 +474,8 @@
     </w:p>
     <w:p>
       <w:pPr>
-        <w:pStyle w:val="BodyText"/>
-        <w:keepLines/>
+        <w:keepLines/>
+        <w:pStyle w:val="BodyText"/>
         <w:bidi w:val="0"/>
         <w:jc w:val="start"/>
         <w:rPr/>
@@ -482,8 +493,8 @@
     </w:p>
     <w:p>
       <w:pPr>
-        <w:pStyle w:val="BodyText"/>
-        <w:keepLines/>
+        <w:keepLines/>
+        <w:pStyle w:val="BodyText"/>
         <w:bidi w:val="0"/>
         <w:jc w:val="start"/>
         <w:rPr/>
@@ -501,8 +512,8 @@
     </w:p>
     <w:p>
       <w:pPr>
-        <w:pStyle w:val="BodyText"/>
-        <w:keepLines/>
+        <w:keepLines/>
+        <w:pStyle w:val="BodyText"/>
         <w:bidi w:val="0"/>
         <w:jc w:val="start"/>
         <w:rPr/>
@@ -520,8 +531,8 @@
     </w:p>
     <w:p>
       <w:pPr>
-        <w:pStyle w:val="BodyText"/>
-        <w:keepLines/>
+        <w:keepLines/>
+        <w:pStyle w:val="BodyText"/>
         <w:bidi w:val="0"/>
         <w:jc w:val="start"/>
         <w:rPr/>
@@ -539,8 +550,8 @@
     </w:p>
     <w:p>
       <w:pPr>
-        <w:pStyle w:val="BodyText"/>
-        <w:keepLines/>
+        <w:keepLines/>
+        <w:pStyle w:val="BodyText"/>
         <w:bidi w:val="0"/>
         <w:jc w:val="start"/>
         <w:rPr/>
@@ -558,8 +569,8 @@
     </w:p>
     <w:p>
       <w:pPr>
+        <w:keepLines/>
         <w:pStyle w:val="Heading2"/>
-        <w:keepLines/>
         <w:bidi w:val="0"/>
         <w:jc w:val="start"/>
         <w:rPr/>
@@ -571,8 +582,8 @@
     </w:p>
     <w:p>
       <w:pPr>
+        <w:keepLines/>
         <w:pStyle w:val="Heading3"/>
-        <w:keepLines/>
         <w:bidi w:val="0"/>
         <w:ind w:hanging="0" w:start="0" w:end="0"/>
         <w:jc w:val="start"/>
@@ -585,8 +596,8 @@
     </w:p>
     <w:p>
       <w:pPr>
-        <w:pStyle w:val="BodyText"/>
-        <w:keepLines/>
+        <w:keepLines/>
+        <w:pStyle w:val="BodyText"/>
         <w:bidi w:val="0"/>
         <w:jc w:val="start"/>
         <w:rPr/>
@@ -604,8 +615,8 @@
     </w:p>
     <w:p>
       <w:pPr>
+        <w:keepLines/>
         <w:pStyle w:val="BodyTextdate"/>
-        <w:keepLines/>
         <w:bidi w:val="0"/>
         <w:jc w:val="start"/>
         <w:rPr/>
@@ -617,8 +628,8 @@
     </w:p>
     <w:p>
       <w:pPr>
-        <w:pStyle w:val="BodyText"/>
-        <w:keepLines/>
+        <w:keepLines/>
+        <w:pStyle w:val="BodyText"/>
         <w:bidi w:val="0"/>
         <w:jc w:val="start"/>
         <w:rPr/>
@@ -630,8 +641,8 @@
     </w:p>
     <w:p>
       <w:pPr>
+        <w:keepLines/>
         <w:pStyle w:val="BodyTextrelevant"/>
-        <w:keepLines/>
         <w:bidi w:val="0"/>
         <w:jc w:val="start"/>
         <w:rPr/>
@@ -649,8 +660,8 @@
     </w:p>
     <w:p>
       <w:pPr>
-        <w:pStyle w:val="BodyText"/>
-        <w:keepLines/>
+        <w:keepLines/>
+        <w:pStyle w:val="BodyText"/>
         <w:numPr>
           <w:ilvl w:val="0"/>
           <w:numId w:val="1"/>
@@ -667,13 +678,13 @@
       </w:pPr>
       <w:r>
         <w:rPr/>
-        <w:t>Design and optimize C#/.NET backend services and REST APIs supporting internal web and mobile applications, external integrations, tens of thousands of users, and millions of security devices.</w:t>
-      </w:r>
-    </w:p>
-    <w:p>
-      <w:pPr>
-        <w:pStyle w:val="BodyText"/>
-        <w:keepLines/>
+        <w:t>Design and optimize C#/.NET backend services and REST APIs for internal web and mobile applications and external integrations, supporting tens of thousands of users and handling more than 100M API requests each month.</w:t>
+      </w:r>
+    </w:p>
+    <w:p>
+      <w:pPr>
+        <w:keepLines/>
+        <w:pStyle w:val="BodyText"/>
         <w:numPr>
           <w:ilvl w:val="0"/>
           <w:numId w:val="1"/>
@@ -695,8 +706,8 @@
     </w:p>
     <w:p>
       <w:pPr>
-        <w:pStyle w:val="BodyText"/>
-        <w:keepLines/>
+        <w:keepLines/>
+        <w:pStyle w:val="BodyText"/>
         <w:numPr>
           <w:ilvl w:val="0"/>
           <w:numId w:val="1"/>
@@ -718,8 +729,8 @@
     </w:p>
     <w:p>
       <w:pPr>
-        <w:pStyle w:val="BodyText"/>
-        <w:keepLines/>
+        <w:keepLines/>
+        <w:pStyle w:val="BodyText"/>
         <w:numPr>
           <w:ilvl w:val="0"/>
           <w:numId w:val="1"/>
@@ -741,8 +752,8 @@
     </w:p>
     <w:p>
       <w:pPr>
-        <w:pStyle w:val="BodyText"/>
-        <w:keepLines/>
+        <w:keepLines/>
+        <w:pStyle w:val="BodyText"/>
         <w:numPr>
           <w:ilvl w:val="0"/>
           <w:numId w:val="1"/>
@@ -764,8 +775,8 @@
     </w:p>
     <w:p>
       <w:pPr>
-        <w:pStyle w:val="BodyText"/>
-        <w:keepLines/>
+        <w:keepLines/>
+        <w:pStyle w:val="BodyText"/>
         <w:numPr>
           <w:ilvl w:val="0"/>
           <w:numId w:val="1"/>
@@ -787,8 +798,8 @@
     </w:p>
     <w:p>
       <w:pPr>
-        <w:pStyle w:val="BodyText"/>
-        <w:keepLines/>
+        <w:keepLines/>
+        <w:pStyle w:val="BodyText"/>
         <w:numPr>
           <w:ilvl w:val="0"/>
           <w:numId w:val="1"/>
@@ -810,8 +821,8 @@
     </w:p>
     <w:p>
       <w:pPr>
-        <w:pStyle w:val="BodyText"/>
-        <w:keepLines/>
+        <w:keepLines/>
+        <w:pStyle w:val="BodyText"/>
         <w:numPr>
           <w:ilvl w:val="0"/>
           <w:numId w:val="1"/>
@@ -833,8 +844,8 @@
     </w:p>
     <w:p>
       <w:pPr>
-        <w:pStyle w:val="BodyText"/>
-        <w:keepLines/>
+        <w:keepLines/>
+        <w:pStyle w:val="BodyText"/>
         <w:numPr>
           <w:ilvl w:val="0"/>
           <w:numId w:val="1"/>
@@ -856,8 +867,8 @@
     </w:p>
     <w:p>
       <w:pPr>
-        <w:pStyle w:val="BodyText"/>
-        <w:keepLines/>
+        <w:keepLines/>
+        <w:pStyle w:val="BodyText"/>
         <w:numPr>
           <w:ilvl w:val="0"/>
           <w:numId w:val="1"/>
@@ -879,8 +890,8 @@
     </w:p>
     <w:p>
       <w:pPr>
-        <w:pStyle w:val="BodyText"/>
-        <w:keepLines/>
+        <w:keepLines/>
+        <w:pStyle w:val="BodyText"/>
         <w:numPr>
           <w:ilvl w:val="0"/>
           <w:numId w:val="1"/>
@@ -902,8 +913,8 @@
     </w:p>
     <w:p>
       <w:pPr>
-        <w:pStyle w:val="BodyText"/>
-        <w:keepLines/>
+        <w:keepLines/>
+        <w:pStyle w:val="BodyText"/>
         <w:numPr>
           <w:ilvl w:val="0"/>
           <w:numId w:val="1"/>
@@ -925,8 +936,8 @@
     </w:p>
     <w:p>
       <w:pPr>
-        <w:pStyle w:val="BodyText"/>
-        <w:keepLines/>
+        <w:keepLines/>
+        <w:pStyle w:val="BodyText"/>
         <w:numPr>
           <w:ilvl w:val="0"/>
           <w:numId w:val="1"/>
@@ -947,8 +958,8 @@
     </w:p>
     <w:p>
       <w:pPr>
+        <w:keepLines/>
         <w:pStyle w:val="Heading3"/>
-        <w:keepLines/>
         <w:bidi w:val="0"/>
         <w:ind w:hanging="0" w:start="0" w:end="0"/>
         <w:jc w:val="start"/>
@@ -961,8 +972,8 @@
     </w:p>
     <w:p>
       <w:pPr>
-        <w:pStyle w:val="BodyText"/>
-        <w:keepLines/>
+        <w:keepLines/>
+        <w:pStyle w:val="BodyText"/>
         <w:bidi w:val="0"/>
         <w:jc w:val="start"/>
         <w:rPr/>
@@ -980,8 +991,8 @@
     </w:p>
     <w:p>
       <w:pPr>
+        <w:keepLines/>
         <w:pStyle w:val="BodyTextdate"/>
-        <w:keepLines/>
         <w:bidi w:val="0"/>
         <w:jc w:val="start"/>
         <w:rPr/>
@@ -993,8 +1004,8 @@
     </w:p>
     <w:p>
       <w:pPr>
-        <w:pStyle w:val="BodyText"/>
-        <w:keepLines/>
+        <w:keepLines/>
+        <w:pStyle w:val="BodyText"/>
         <w:bidi w:val="0"/>
         <w:jc w:val="start"/>
         <w:rPr/>
@@ -1006,8 +1017,8 @@
     </w:p>
     <w:p>
       <w:pPr>
+        <w:keepLines/>
         <w:pStyle w:val="BodyTextrelevant"/>
-        <w:keepLines/>
         <w:bidi w:val="0"/>
         <w:jc w:val="start"/>
         <w:rPr/>
@@ -1025,8 +1036,8 @@
     </w:p>
     <w:p>
       <w:pPr>
-        <w:pStyle w:val="BodyText"/>
-        <w:keepLines/>
+        <w:keepLines/>
+        <w:pStyle w:val="BodyText"/>
         <w:numPr>
           <w:ilvl w:val="0"/>
           <w:numId w:val="2"/>
@@ -1048,8 +1059,8 @@
     </w:p>
     <w:p>
       <w:pPr>
-        <w:pStyle w:val="BodyText"/>
-        <w:keepLines/>
+        <w:keepLines/>
+        <w:pStyle w:val="BodyText"/>
         <w:numPr>
           <w:ilvl w:val="0"/>
           <w:numId w:val="2"/>
@@ -1071,8 +1082,8 @@
     </w:p>
     <w:p>
       <w:pPr>
-        <w:pStyle w:val="BodyText"/>
-        <w:keepLines/>
+        <w:keepLines/>
+        <w:pStyle w:val="BodyText"/>
         <w:numPr>
           <w:ilvl w:val="0"/>
           <w:numId w:val="2"/>
@@ -1094,8 +1105,8 @@
     </w:p>
     <w:p>
       <w:pPr>
-        <w:pStyle w:val="BodyText"/>
-        <w:keepLines/>
+        <w:keepLines/>
+        <w:pStyle w:val="BodyText"/>
         <w:numPr>
           <w:ilvl w:val="0"/>
           <w:numId w:val="2"/>
@@ -1117,8 +1128,8 @@
     </w:p>
     <w:p>
       <w:pPr>
-        <w:pStyle w:val="BodyText"/>
-        <w:keepLines/>
+        <w:keepLines/>
+        <w:pStyle w:val="BodyText"/>
         <w:numPr>
           <w:ilvl w:val="0"/>
           <w:numId w:val="2"/>
@@ -1140,8 +1151,8 @@
     </w:p>
     <w:p>
       <w:pPr>
-        <w:pStyle w:val="BodyText"/>
-        <w:keepLines/>
+        <w:keepLines/>
+        <w:pStyle w:val="BodyText"/>
         <w:numPr>
           <w:ilvl w:val="0"/>
           <w:numId w:val="2"/>
@@ -1163,8 +1174,8 @@
     </w:p>
     <w:p>
       <w:pPr>
-        <w:pStyle w:val="BodyText"/>
-        <w:keepLines/>
+        <w:keepLines/>
+        <w:pStyle w:val="BodyText"/>
         <w:numPr>
           <w:ilvl w:val="0"/>
           <w:numId w:val="2"/>
@@ -1186,8 +1197,8 @@
     </w:p>
     <w:p>
       <w:pPr>
-        <w:pStyle w:val="BodyText"/>
-        <w:keepLines/>
+        <w:keepLines/>
+        <w:pStyle w:val="BodyText"/>
         <w:numPr>
           <w:ilvl w:val="0"/>
           <w:numId w:val="2"/>
@@ -1209,8 +1220,8 @@
     </w:p>
     <w:p>
       <w:pPr>
-        <w:pStyle w:val="BodyText"/>
-        <w:keepLines/>
+        <w:keepLines/>
+        <w:pStyle w:val="BodyText"/>
         <w:numPr>
           <w:ilvl w:val="0"/>
           <w:numId w:val="2"/>
@@ -1232,8 +1243,8 @@
     </w:p>
     <w:p>
       <w:pPr>
-        <w:pStyle w:val="BodyText"/>
-        <w:keepLines/>
+        <w:keepLines/>
+        <w:pStyle w:val="BodyText"/>
         <w:numPr>
           <w:ilvl w:val="0"/>
           <w:numId w:val="2"/>
@@ -1254,8 +1265,8 @@
     </w:p>
     <w:p>
       <w:pPr>
+        <w:keepLines/>
         <w:pStyle w:val="BodyTextpage-break"/>
-        <w:keepLines/>
         <w:bidi w:val="0"/>
         <w:jc w:val="start"/>
         <w:rPr/>
@@ -1267,8 +1278,8 @@
     </w:p>
     <w:p>
       <w:pPr>
+        <w:keepLines/>
         <w:pStyle w:val="Heading3"/>
-        <w:keepLines/>
         <w:bidi w:val="0"/>
         <w:ind w:hanging="0" w:start="0" w:end="0"/>
         <w:jc w:val="start"/>
@@ -1281,8 +1292,8 @@
     </w:p>
     <w:p>
       <w:pPr>
-        <w:pStyle w:val="BodyText"/>
-        <w:keepLines/>
+        <w:keepLines/>
+        <w:pStyle w:val="BodyText"/>
         <w:bidi w:val="0"/>
         <w:jc w:val="start"/>
         <w:rPr/>
@@ -1300,8 +1311,8 @@
     </w:p>
     <w:p>
       <w:pPr>
+        <w:keepLines/>
         <w:pStyle w:val="BodyTextdate"/>
-        <w:keepLines/>
         <w:bidi w:val="0"/>
         <w:jc w:val="start"/>
         <w:rPr/>
@@ -1313,8 +1324,8 @@
     </w:p>
     <w:p>
       <w:pPr>
-        <w:pStyle w:val="BodyText"/>
-        <w:keepLines/>
+        <w:keepLines/>
+        <w:pStyle w:val="BodyText"/>
         <w:bidi w:val="0"/>
         <w:jc w:val="start"/>
         <w:rPr/>
@@ -1326,8 +1337,8 @@
     </w:p>
     <w:p>
       <w:pPr>
+        <w:keepLines/>
         <w:pStyle w:val="BodyTextrelevant"/>
-        <w:keepLines/>
         <w:bidi w:val="0"/>
         <w:jc w:val="start"/>
         <w:rPr/>
@@ -1345,8 +1356,8 @@
     </w:p>
     <w:p>
       <w:pPr>
-        <w:pStyle w:val="BodyText"/>
-        <w:keepLines/>
+        <w:keepLines/>
+        <w:pStyle w:val="BodyText"/>
         <w:numPr>
           <w:ilvl w:val="0"/>
           <w:numId w:val="3"/>
@@ -1368,8 +1379,8 @@
     </w:p>
     <w:p>
       <w:pPr>
-        <w:pStyle w:val="BodyText"/>
-        <w:keepLines/>
+        <w:keepLines/>
+        <w:pStyle w:val="BodyText"/>
         <w:numPr>
           <w:ilvl w:val="0"/>
           <w:numId w:val="3"/>
@@ -1391,8 +1402,8 @@
     </w:p>
     <w:p>
       <w:pPr>
-        <w:pStyle w:val="BodyText"/>
-        <w:keepLines/>
+        <w:keepLines/>
+        <w:pStyle w:val="BodyText"/>
         <w:numPr>
           <w:ilvl w:val="0"/>
           <w:numId w:val="3"/>
@@ -1413,8 +1424,8 @@
     </w:p>
     <w:p>
       <w:pPr>
-        <w:pStyle w:val="BodyText"/>
-        <w:keepLines/>
+        <w:keepLines/>
+        <w:pStyle w:val="BodyText"/>
         <w:bidi w:val="0"/>
         <w:jc w:val="start"/>
         <w:rPr/>
@@ -1432,8 +1443,8 @@
     </w:p>
     <w:p>
       <w:pPr>
+        <w:keepLines/>
         <w:pStyle w:val="BodyTextdate"/>
-        <w:keepLines/>
         <w:bidi w:val="0"/>
         <w:jc w:val="start"/>
         <w:rPr/>
@@ -1445,8 +1456,8 @@
     </w:p>
     <w:p>
       <w:pPr>
-        <w:pStyle w:val="BodyText"/>
-        <w:keepLines/>
+        <w:keepLines/>
+        <w:pStyle w:val="BodyText"/>
         <w:bidi w:val="0"/>
         <w:jc w:val="start"/>
         <w:rPr/>
@@ -1458,8 +1469,8 @@
     </w:p>
     <w:p>
       <w:pPr>
+        <w:keepLines/>
         <w:pStyle w:val="BodyTextrelevant"/>
-        <w:keepLines/>
         <w:bidi w:val="0"/>
         <w:jc w:val="start"/>
         <w:rPr/>
@@ -1477,8 +1488,8 @@
     </w:p>
     <w:p>
       <w:pPr>
-        <w:pStyle w:val="BodyText"/>
-        <w:keepLines/>
+        <w:keepLines/>
+        <w:pStyle w:val="BodyText"/>
         <w:numPr>
           <w:ilvl w:val="0"/>
           <w:numId w:val="4"/>
@@ -1500,8 +1511,8 @@
     </w:p>
     <w:p>
       <w:pPr>
-        <w:pStyle w:val="BodyText"/>
-        <w:keepLines/>
+        <w:keepLines/>
+        <w:pStyle w:val="BodyText"/>
         <w:numPr>
           <w:ilvl w:val="0"/>
           <w:numId w:val="4"/>
@@ -1523,8 +1534,8 @@
     </w:p>
     <w:p>
       <w:pPr>
-        <w:pStyle w:val="BodyText"/>
-        <w:keepLines/>
+        <w:keepLines/>
+        <w:pStyle w:val="BodyText"/>
         <w:numPr>
           <w:ilvl w:val="0"/>
           <w:numId w:val="4"/>
@@ -1546,8 +1557,8 @@
     </w:p>
     <w:p>
       <w:pPr>
-        <w:pStyle w:val="BodyText"/>
-        <w:keepLines/>
+        <w:keepLines/>
+        <w:pStyle w:val="BodyText"/>
         <w:numPr>
           <w:ilvl w:val="0"/>
           <w:numId w:val="4"/>
@@ -1568,8 +1579,8 @@
     </w:p>
     <w:p>
       <w:pPr>
+        <w:keepLines/>
         <w:pStyle w:val="Heading2"/>
-        <w:keepLines/>
         <w:bidi w:val="0"/>
         <w:jc w:val="start"/>
         <w:rPr/>
@@ -1581,8 +1592,8 @@
     </w:p>
     <w:p>
       <w:pPr>
-        <w:pStyle w:val="BodyText"/>
-        <w:keepLines/>
+        <w:keepLines/>
+        <w:pStyle w:val="BodyText"/>
         <w:bidi w:val="0"/>
         <w:jc w:val="start"/>
         <w:rPr/>
@@ -1600,8 +1611,8 @@
     </w:p>
     <w:p>
       <w:pPr>
+        <w:keepLines/>
         <w:pStyle w:val="BodyTextdate"/>
-        <w:keepLines/>
         <w:bidi w:val="0"/>
         <w:jc w:val="start"/>
         <w:rPr/>
@@ -1613,8 +1624,8 @@
     </w:p>
     <w:p>
       <w:pPr>
+        <w:keepLines/>
         <w:pStyle w:val="Heading2"/>
-        <w:keepLines/>
         <w:bidi w:val="0"/>
         <w:jc w:val="start"/>
         <w:rPr/>
@@ -1626,8 +1637,8 @@
     </w:p>
     <w:p>
       <w:pPr>
-        <w:pStyle w:val="BodyText"/>
-        <w:keepLines/>
+        <w:keepLines/>
+        <w:pStyle w:val="BodyText"/>
         <w:bidi w:val="0"/>
         <w:spacing w:before="0" w:after="100"/>
         <w:jc w:val="start"/>
@@ -1637,6 +1648,7 @@
         <w:r>
           <w:rPr>
             <w:rStyle w:val="Hyperlink"/>
+            <w:b/>
             <w:b/>
             <w:bCs/>
           </w:rPr>
@@ -1644,33 +1656,8 @@
         </w:r>
       </w:hyperlink>
       <w:r>
-        <w:rPr>
-          <w:rStyle w:val="Hyperlink"/>
-          <w:b/>
-          <w:bCs/>
-        </w:rPr>
-        <w:t xml:space="preserve"> </w:t>
-      </w:r>
-      <w:r>
-        <w:rPr>
-          <w:rStyle w:val="Hyperlink"/>
-          <w:rFonts w:eastAsia="Arial;Helvetica;sans-serif" w:cs="Arial;Helvetica;sans-serif"/>
-          <w:color w:val="536058"/>
-          <w:sz w:val="16"/>
-          <w:szCs w:val="16"/>
-          <w:lang w:val="en-US" w:eastAsia="zh-CN" w:bidi="hi-IN"/>
-        </w:rPr>
-        <w:t xml:space="preserve">- </w:t>
-      </w:r>
-      <w:r>
-        <w:rPr>
-          <w:rFonts w:eastAsia="Arial;Helvetica;sans-serif" w:cs="Arial;Helvetica;sans-serif"/>
-          <w:color w:val="536058"/>
-          <w:sz w:val="16"/>
-          <w:szCs w:val="16"/>
-          <w:lang w:val="en-US" w:eastAsia="zh-CN" w:bidi="hi-IN"/>
-        </w:rPr>
-        <w:t>December 2021</w:t>
+        <w:rPr/>
+        <w:t xml:space="preserve"> - December 2021</w:t>
       </w:r>
     </w:p>
     <w:sectPr>
@@ -1680,7 +1667,7 @@
       <w:pgNumType w:fmt="decimal"/>
       <w:formProt w:val="false"/>
       <w:textDirection w:val="lrTb"/>
-      <w:docGrid w:type="default" w:linePitch="600" w:charSpace="46079"/>
+      <w:docGrid w:type="default" w:linePitch="600" w:charSpace="46284"/>
     </w:sectPr>
   </w:body>
 </w:document>
@@ -2253,6 +2240,7 @@
     <w:lvl w:ilvl="1">
       <w:start w:val="1"/>
       <w:numFmt w:val="none"/>
+      <w:pStyle w:val="Heading2"/>
       <w:suff w:val="nothing"/>
       <w:lvlText w:val=""/>
       <w:lvlJc w:val="start"/>
@@ -2266,6 +2254,7 @@
     <w:lvl w:ilvl="2">
       <w:start w:val="1"/>
       <w:numFmt w:val="none"/>
+      <w:pStyle w:val="Heading3"/>
       <w:suff w:val="nothing"/>
       <w:lvlText w:val=""/>
       <w:lvlJc w:val="start"/>
@@ -2395,15 +2384,12 @@
     <w:qFormat/>
     <w:pPr>
       <w:widowControl w:val="false"/>
-      <w:suppressAutoHyphens w:val="true"/>
       <w:bidi w:val="0"/>
-      <w:spacing w:lineRule="auto" w:line="314" w:before="0" w:after="0"/>
-      <w:jc w:val="start"/>
+      <w:spacing w:lineRule="auto" w:line="314"/>
     </w:pPr>
     <w:rPr>
       <w:rFonts w:ascii="Arial;Helvetica;sans-serif" w:hAnsi="Arial;Helvetica;sans-serif" w:eastAsia="Arial;Helvetica;sans-serif" w:cs="Arial;Helvetica;sans-serif"/>
       <w:color w:val="1F2923"/>
-      <w:kern w:val="0"/>
       <w:sz w:val="17"/>
       <w:szCs w:val="17"/>
       <w:lang w:val="en-US" w:eastAsia="zh-CN" w:bidi="hi-IN"/>
@@ -2466,22 +2452,8 @@
       <w:szCs w:val="25"/>
     </w:rPr>
   </w:style>
-  <w:style w:type="character" w:styleId="EndnoteCharacters">
-    <w:name w:val="Endnote Characters"/>
-    <w:qFormat/>
-    <w:rPr>
-      <w:vertAlign w:val="superscript"/>
-    </w:rPr>
-  </w:style>
   <w:style w:type="character" w:styleId="EndnoteReference">
     <w:name w:val="endnote reference"/>
-    <w:rPr>
-      <w:vertAlign w:val="superscript"/>
-    </w:rPr>
-  </w:style>
-  <w:style w:type="character" w:styleId="FootnoteCharacters">
-    <w:name w:val="Footnote Characters"/>
-    <w:qFormat/>
     <w:rPr>
       <w:vertAlign w:val="superscript"/>
     </w:rPr>
@@ -2492,13 +2464,13 @@
       <w:vertAlign w:val="superscript"/>
     </w:rPr>
   </w:style>
-  <w:style w:type="character" w:styleId="EndnoteCharactersuser">
-    <w:name w:val="Endnote Characters (user)"/>
+  <w:style w:type="character" w:styleId="EndnoteCharacters">
+    <w:name w:val="Endnote Characters"/>
     <w:qFormat/>
     <w:rPr/>
   </w:style>
-  <w:style w:type="character" w:styleId="FootnoteCharactersuser">
-    <w:name w:val="Footnote Characters (user)"/>
+  <w:style w:type="character" w:styleId="FootnoteCharacters">
+    <w:name w:val="Footnote Characters"/>
     <w:qFormat/>
     <w:rPr/>
   </w:style>
@@ -2530,69 +2502,11 @@
       <w:bCs/>
     </w:rPr>
   </w:style>
-  <w:style w:type="character" w:styleId="Bulletsuser">
-    <w:name w:val="Bullets (user)"/>
+  <w:style w:type="character" w:styleId="Bullets">
+    <w:name w:val="Bullets"/>
     <w:qFormat/>
     <w:rPr>
       <w:rFonts w:ascii="OpenSymbol" w:hAnsi="OpenSymbol" w:eastAsia="OpenSymbol" w:cs="OpenSymbol"/>
-    </w:rPr>
-  </w:style>
-  <w:style w:type="paragraph" w:styleId="Heading">
-    <w:name w:val="Heading"/>
-    <w:basedOn w:val="Normal"/>
-    <w:next w:val="BodyText"/>
-    <w:qFormat/>
-    <w:pPr>
-      <w:keepNext w:val="true"/>
-      <w:spacing w:before="240" w:after="283"/>
-    </w:pPr>
-    <w:rPr>
-      <w:rFonts w:ascii="Liberation Sans" w:hAnsi="Liberation Sans"/>
-      <w:sz w:val="28"/>
-      <w:szCs w:val="28"/>
-    </w:rPr>
-  </w:style>
-  <w:style w:type="paragraph" w:styleId="BodyText">
-    <w:name w:val="Body Text"/>
-    <w:basedOn w:val="Normal"/>
-    <w:pPr>
-      <w:spacing w:before="0" w:after="100"/>
-    </w:pPr>
-    <w:rPr/>
-  </w:style>
-  <w:style w:type="paragraph" w:styleId="List">
-    <w:name w:val="List"/>
-    <w:basedOn w:val="BodyText"/>
-    <w:pPr/>
-    <w:rPr>
-      <w:rFonts w:cs="Noto Sans Devanagari"/>
-    </w:rPr>
-  </w:style>
-  <w:style w:type="paragraph" w:styleId="Caption">
-    <w:name w:val="caption"/>
-    <w:basedOn w:val="Normal"/>
-    <w:qFormat/>
-    <w:pPr>
-      <w:suppressLineNumbers/>
-      <w:spacing w:before="120" w:after="120"/>
-    </w:pPr>
-    <w:rPr>
-      <w:rFonts w:cs="Noto Sans Devanagari"/>
-      <w:i/>
-      <w:iCs/>
-      <w:sz w:val="24"/>
-      <w:szCs w:val="24"/>
-    </w:rPr>
-  </w:style>
-  <w:style w:type="paragraph" w:styleId="Index">
-    <w:name w:val="Index"/>
-    <w:basedOn w:val="Normal"/>
-    <w:qFormat/>
-    <w:pPr>
-      <w:suppressLineNumbers/>
-    </w:pPr>
-    <w:rPr>
-      <w:rFonts w:cs="Noto Sans Devanagari"/>
     </w:rPr>
   </w:style>
   <w:style w:type="paragraph" w:styleId="HorizontalLine">
@@ -2624,6 +2538,64 @@
     <w:qFormat/>
     <w:pPr/>
     <w:rPr/>
+  </w:style>
+  <w:style w:type="paragraph" w:styleId="Index">
+    <w:name w:val="Index"/>
+    <w:basedOn w:val="Normal"/>
+    <w:qFormat/>
+    <w:pPr>
+      <w:suppressLineNumbers/>
+    </w:pPr>
+    <w:rPr>
+      <w:rFonts w:cs="Noto Sans Devanagari"/>
+    </w:rPr>
+  </w:style>
+  <w:style w:type="paragraph" w:styleId="Caption">
+    <w:name w:val="caption"/>
+    <w:basedOn w:val="Normal"/>
+    <w:qFormat/>
+    <w:pPr>
+      <w:suppressLineNumbers/>
+      <w:spacing w:before="120" w:after="120"/>
+    </w:pPr>
+    <w:rPr>
+      <w:rFonts w:cs="Noto Sans Devanagari"/>
+      <w:i/>
+      <w:iCs/>
+      <w:sz w:val="24"/>
+      <w:szCs w:val="24"/>
+    </w:rPr>
+  </w:style>
+  <w:style w:type="paragraph" w:styleId="List">
+    <w:name w:val="List"/>
+    <w:basedOn w:val="BodyText"/>
+    <w:pPr/>
+    <w:rPr>
+      <w:rFonts w:cs="Noto Sans Devanagari"/>
+    </w:rPr>
+  </w:style>
+  <w:style w:type="paragraph" w:styleId="BodyText">
+    <w:name w:val="Body Text"/>
+    <w:basedOn w:val="Normal"/>
+    <w:pPr>
+      <w:spacing w:before="0" w:after="100"/>
+    </w:pPr>
+    <w:rPr/>
+  </w:style>
+  <w:style w:type="paragraph" w:styleId="Heading">
+    <w:name w:val="Heading"/>
+    <w:basedOn w:val="Normal"/>
+    <w:next w:val="BodyText"/>
+    <w:qFormat/>
+    <w:pPr>
+      <w:keepNext w:val="true"/>
+      <w:spacing w:before="240" w:after="283"/>
+    </w:pPr>
+    <w:rPr>
+      <w:rFonts w:ascii="Liberation Sans" w:hAnsi="Liberation Sans"/>
+      <w:sz w:val="28"/>
+      <w:szCs w:val="28"/>
+    </w:rPr>
   </w:style>
   <w:style w:type="paragraph" w:styleId="TableHeading">
     <w:name w:val="Table Heading"/>

</xml_diff>

<commit_message>
Enhance portfolio content and resume exports
</commit_message>
<xml_diff>
--- a/assets/documents/Kirk_Tolleshaug_Resume.docx
+++ b/assets/documents/Kirk_Tolleshaug_Resume.docx
@@ -138,10 +138,11 @@
       <w:r>
         <w:rPr>
           <w:color w:val="536058"/>
+          <w:position w:val="-6"/>
         </w:rPr>
         <w:drawing>
           <wp:inline distT="0" distB="0" distL="0" distR="0">
-            <wp:extent cx="101600" cy="101600"/>
+            <wp:extent cx="94615" cy="94615"/>
             <wp:effectExtent l="0" t="0" r="0" b="0"/>
             <wp:docPr id="2" name="Image2"/>
             <wp:cNvGraphicFramePr>
@@ -165,7 +166,7 @@
                   <pic:spPr bwMode="auto">
                     <a:xfrm>
                       <a:off x="0" y="0"/>
-                      <a:ext cx="101600" cy="101600"/>
+                      <a:ext cx="94615" cy="94615"/>
                     </a:xfrm>
                     <a:prstGeom prst="rect">
                       <a:avLst/>
@@ -189,10 +190,11 @@
         <w:rPr>
           <w:color w:val="536058"/>
           <w:sz w:val="15"/>
+          <w:position w:val="-6"/>
         </w:rPr>
         <w:drawing>
           <wp:inline distT="0" distB="0" distL="0" distR="0">
-            <wp:extent cx="101600" cy="101600"/>
+            <wp:extent cx="94615" cy="94615"/>
             <wp:effectExtent l="0" t="0" r="0" b="0"/>
             <wp:docPr id="3" name="Image3"/>
             <wp:cNvGraphicFramePr>
@@ -216,7 +218,7 @@
                   <pic:spPr bwMode="auto">
                     <a:xfrm>
                       <a:off x="0" y="0"/>
-                      <a:ext cx="101600" cy="101600"/>
+                      <a:ext cx="94615" cy="94615"/>
                     </a:xfrm>
                     <a:prstGeom prst="rect">
                       <a:avLst/>
@@ -250,10 +252,11 @@
         <w:rPr>
           <w:color w:val="536058"/>
           <w:sz w:val="15"/>
+          <w:position w:val="-6"/>
         </w:rPr>
         <w:drawing>
           <wp:inline distT="0" distB="0" distL="0" distR="0">
-            <wp:extent cx="101600" cy="101600"/>
+            <wp:extent cx="94615" cy="94615"/>
             <wp:effectExtent l="0" t="0" r="0" b="0"/>
             <wp:docPr id="4" name="Image4"/>
             <wp:cNvGraphicFramePr>
@@ -277,7 +280,7 @@
                   <pic:spPr bwMode="auto">
                     <a:xfrm>
                       <a:off x="0" y="0"/>
-                      <a:ext cx="101600" cy="101600"/>
+                      <a:ext cx="94615" cy="94615"/>
                     </a:xfrm>
                     <a:prstGeom prst="rect">
                       <a:avLst/>
@@ -311,10 +314,11 @@
         <w:rPr>
           <w:color w:val="536058"/>
           <w:sz w:val="15"/>
+          <w:position w:val="-6"/>
         </w:rPr>
         <w:drawing>
           <wp:inline distT="0" distB="0" distL="0" distR="0">
-            <wp:extent cx="101600" cy="101600"/>
+            <wp:extent cx="94615" cy="94615"/>
             <wp:effectExtent l="0" t="0" r="0" b="0"/>
             <wp:docPr id="5" name="Image5"/>
             <wp:cNvGraphicFramePr>
@@ -338,7 +342,7 @@
                   <pic:spPr bwMode="auto">
                     <a:xfrm>
                       <a:off x="0" y="0"/>
-                      <a:ext cx="101600" cy="101600"/>
+                      <a:ext cx="94615" cy="94615"/>
                     </a:xfrm>
                     <a:prstGeom prst="rect">
                       <a:avLst/>
@@ -1638,7 +1642,7 @@
     <w:p>
       <w:pPr>
         <w:keepLines/>
-        <w:pStyle w:val="BodyText"/>
+        <w:pStyle w:val="BodyTextcertificate"/>
         <w:bidi w:val="0"/>
         <w:spacing w:before="0" w:after="100"/>
         <w:jc w:val="start"/>
@@ -1652,9 +1656,54 @@
             <w:b/>
             <w:bCs/>
           </w:rPr>
-          <w:t>Azure Fundamentals ↗</w:t>
+          <w:t>Azure Fundamentals</w:t>
         </w:r>
       </w:hyperlink>
+      <w:r>
+        <w:rPr/>
+        <w:t xml:space="preserve"> </w:t>
+      </w:r>
+      <w:r>
+        <w:rPr/>
+        <w:drawing>
+          <wp:inline distT="0" distB="0" distL="0" distR="0">
+            <wp:extent cx="94615" cy="94615"/>
+            <wp:effectExtent l="0" t="0" r="0" b="0"/>
+            <wp:docPr id="6" name="Image6"/>
+            <wp:cNvGraphicFramePr>
+              <a:graphicFrameLocks xmlns:a="http://schemas.openxmlformats.org/drawingml/2006/main" noChangeAspect="1"/>
+            </wp:cNvGraphicFramePr>
+            <a:graphic xmlns:a="http://schemas.openxmlformats.org/drawingml/2006/main">
+              <a:graphicData uri="http://schemas.openxmlformats.org/drawingml/2006/picture">
+                <pic:pic xmlns:pic="http://schemas.openxmlformats.org/drawingml/2006/picture">
+                  <pic:nvPicPr>
+                    <pic:cNvPr id="6" name="Image6"/>
+                    <pic:cNvPicPr>
+                      <a:picLocks noChangeAspect="1" noChangeArrowheads="1"/>
+                    </pic:cNvPicPr>
+                  </pic:nvPicPr>
+                  <pic:blipFill>
+                    <a:blip r:embed="rId11"/>
+                    <a:stretch>
+                      <a:fillRect/>
+                    </a:stretch>
+                  </pic:blipFill>
+                  <pic:spPr bwMode="auto">
+                    <a:xfrm>
+                      <a:off x="0" y="0"/>
+                      <a:ext cx="94615" cy="94615"/>
+                    </a:xfrm>
+                    <a:prstGeom prst="rect">
+                      <a:avLst/>
+                    </a:prstGeom>
+                    <a:noFill/>
+                  </pic:spPr>
+                </pic:pic>
+              </a:graphicData>
+            </a:graphic>
+          </wp:inline>
+        </w:drawing>
+      </w:r>
       <w:r>
         <w:rPr/>
         <w:t xml:space="preserve"> - December 2021</w:t>
@@ -2646,6 +2695,15 @@
     </w:pPr>
     <w:rPr/>
   </w:style>
+  <w:style w:type="paragraph" w:styleId="BodyTextcertificate">
+    <w:name w:val="Body Text.certificate"/>
+    <w:basedOn w:val="BodyText"/>
+    <w:qFormat/>
+    <w:pPr>
+      <w:spacing w:before="0" w:after="100"/>
+    </w:pPr>
+    <w:rPr/>
+  </w:style>
 </w:styles>
 </file>
 

</xml_diff>